<commit_message>
resave .docx files to see if it fixes corrupted file
</commit_message>
<xml_diff>
--- a/_extensions/aagi/docx-short-report/template.docx
+++ b/_extensions/aagi/docx-short-report/template.docx
@@ -1,29 +1,33 @@
 
 <file path=word/document.xml><?xml version="1.0" encoding="utf-8"?>
-<w:document xmlns:wpc="http://schemas.microsoft.com/office/word/2010/wordprocessingCanvas" xmlns:cx="http://schemas.microsoft.com/office/drawing/2014/chartex" xmlns:cx1="http://schemas.microsoft.com/office/drawing/2015/9/8/chartex" xmlns:cx2="http://schemas.microsoft.com/office/drawing/2015/10/21/chartex" xmlns:cx3="http://schemas.microsoft.com/office/drawing/2016/5/9/chartex" xmlns:cx4="http://schemas.microsoft.com/office/drawing/2016/5/10/chartex" xmlns:cx5="http://schemas.microsoft.com/office/drawing/2016/5/11/chartex" xmlns:cx6="http://schemas.microsoft.com/office/drawing/2016/5/12/chartex" xmlns:cx7="http://schemas.microsoft.com/office/drawing/2016/5/13/chartex" xmlns:cx8="http://schemas.microsoft.com/office/drawing/2016/5/14/chartex" xmlns:mc="http://schemas.openxmlformats.org/markup-compatibility/2006" xmlns:aink="http://schemas.microsoft.com/office/drawing/2016/ink" xmlns:am3d="http://schemas.microsoft.com/office/drawing/2017/model3d" xmlns:o="urn:schemas-microsoft-com:office:office" xmlns:oel="http://schemas.microsoft.com/office/2019/extlst" xmlns:r="http://schemas.openxmlformats.org/officeDocument/2006/relationships" xmlns:m="http://schemas.openxmlformats.org/officeDocument/2006/math" xmlns:v="urn:schemas-microsoft-com:vml" xmlns:wp14="http://schemas.microsoft.com/office/word/2010/wordprocessingDrawing" xmlns:wp="http://schemas.openxmlformats.org/drawingml/2006/wordprocessingDrawing" xmlns:w10="urn:schemas-microsoft-com:office:word" xmlns:w="http://schemas.openxmlformats.org/wordprocessingml/2006/main" xmlns:w14="http://schemas.microsoft.com/office/word/2010/wordml" xmlns:w15="http://schemas.microsoft.com/office/word/2012/wordml" xmlns:w16cex="http://schemas.microsoft.com/office/word/2018/wordml/cex" xmlns:w16cid="http://schemas.microsoft.com/office/word/2016/wordml/cid" xmlns:w16="http://schemas.microsoft.com/office/word/2018/wordml" xmlns:w16du="http://schemas.microsoft.com/office/word/2023/wordml/word16du" xmlns:w16sdtdh="http://schemas.microsoft.com/office/word/2020/wordml/sdtdatahash" xmlns:w16sdtfl="http://schemas.microsoft.com/office/word/2024/wordml/sdtformatlock" xmlns:w16se="http://schemas.microsoft.com/office/word/2015/wordml/symex" xmlns:wpg="http://schemas.microsoft.com/office/word/2010/wordprocessingGroup" xmlns:wpi="http://schemas.microsoft.com/office/word/2010/wordprocessingInk" xmlns:wne="http://schemas.microsoft.com/office/word/2006/wordml" xmlns:wps="http://schemas.microsoft.com/office/word/2010/wordprocessingShape" mc:Ignorable="w14 w15 w16se w16cid w16 w16cex w16sdtdh w16sdtfl w16du wp14">
+<w:document xmlns:o="urn:schemas-microsoft-com:office:office" xmlns:r="http://schemas.openxmlformats.org/officeDocument/2006/relationships" xmlns:v="urn:schemas-microsoft-com:vml" xmlns:w="http://schemas.openxmlformats.org/wordprocessingml/2006/main" xmlns:w10="urn:schemas-microsoft-com:office:word" xmlns:wp="http://schemas.openxmlformats.org/drawingml/2006/wordprocessingDrawing" xmlns:pic="http://schemas.openxmlformats.org/drawingml/2006/picture" xmlns:wps="http://schemas.microsoft.com/office/word/2010/wordprocessingShape" xmlns:wpg="http://schemas.microsoft.com/office/word/2010/wordprocessingGroup" xmlns:mc="http://schemas.openxmlformats.org/markup-compatibility/2006" xmlns:wp14="http://schemas.microsoft.com/office/word/2010/wordprocessingDrawing" xmlns:w14="http://schemas.microsoft.com/office/word/2010/wordml" xmlns:w15="http://schemas.microsoft.com/office/word/2012/wordml" mc:Ignorable="w14 wp14 w15">
   <w:body>
     <w:p>
       <w:pPr>
         <w:pStyle w:val="Title"/>
+        <w:spacing w:before="0" w:after="280"/>
+        <w:rPr/>
       </w:pPr>
       <w:r>
+        <w:rPr/>
         <w:t>Progress report for project ABC1234-567XYZ</w:t>
       </w:r>
     </w:p>
     <w:p>
       <w:pPr>
         <w:pStyle w:val="Subtitle"/>
+        <w:spacing w:before="280" w:after="280"/>
+        <w:rPr/>
       </w:pPr>
       <w:r>
-        <w:t xml:space="preserve">GRDC Investment Project </w:t>
-      </w:r>
-      <w:r>
-        <w:t>XXXXXXX-XXX</w:t>
+        <w:rPr/>
+        <w:t>GRDC Investment Project XXXXXXX-XXX</w:t>
       </w:r>
     </w:p>
     <w:p>
       <w:pPr>
         <w:pStyle w:val="Author"/>
+        <w:rPr/>
       </w:pPr>
       <w:r>
         <w:rPr>
@@ -34,42 +38,47 @@
     </w:p>
     <w:p>
       <w:pPr>
-        <w:pStyle w:val="EmailSignature"/>
+        <w:pStyle w:val="E-mailSignature"/>
+        <w:rPr/>
       </w:pPr>
       <w:r>
+        <w:rPr/>
         <w:t>Date</w:t>
       </w:r>
     </w:p>
     <w:p>
       <w:pPr>
         <w:pStyle w:val="BodyText"/>
+        <w:spacing w:before="180" w:after="0"/>
+        <w:rPr/>
+        <w:sectPr>
+          <w:headerReference w:type="even" r:id="rId2"/>
+          <w:headerReference w:type="default" r:id="rId3"/>
+          <w:headerReference w:type="first" r:id="rId4"/>
+          <w:footerReference w:type="even" r:id="rId5"/>
+          <w:footerReference w:type="default" r:id="rId6"/>
+          <w:footerReference w:type="first" r:id="rId7"/>
+          <w:type w:val="nextPage"/>
+          <w:pgSz w:w="11906" w:h="16838"/>
+          <w:pgMar w:left="1077" w:right="1077" w:gutter="0" w:header="567" w:top="1440" w:footer="567" w:bottom="1134"/>
+          <w:pgNumType w:start="0" w:fmt="decimal"/>
+          <w:formProt w:val="false"/>
+          <w:titlePg/>
+          <w:textDirection w:val="lrTb"/>
+          <w:docGrid w:type="default" w:linePitch="326" w:charSpace="0"/>
+        </w:sectPr>
       </w:pPr>
+      <w:r>
+        <w:rPr/>
+      </w:r>
     </w:p>
     <w:p>
       <w:pPr>
         <w:pStyle w:val="AbstractTitle"/>
-        <w:sectPr>
-          <w:headerReference w:type="even" r:id="rId11"/>
-          <w:headerReference w:type="default" r:id="rId12"/>
-          <w:footerReference w:type="even" r:id="rId13"/>
-          <w:footerReference w:type="default" r:id="rId14"/>
-          <w:headerReference w:type="first" r:id="rId15"/>
-          <w:footerReference w:type="first" r:id="rId16"/>
-          <w:pgSz w:w="11900" w:h="16840" w:code="9"/>
-          <w:pgMar w:top="1440" w:right="1077" w:bottom="1134" w:left="1077" w:header="567" w:footer="567" w:gutter="0"/>
-          <w:pgNumType w:start="0"/>
-          <w:cols w:space="720"/>
-          <w:titlePg/>
-          <w:docGrid w:linePitch="326"/>
-        </w:sectPr>
+        <w:rPr/>
       </w:pPr>
-    </w:p>
-    <w:p>
-      <w:pPr>
-        <w:pStyle w:val="AbstractTitle"/>
-      </w:pPr>
-      <w:r>
-        <w:lastRenderedPageBreak/>
+      <w:r>
+        <w:rPr/>
         <w:t>Abstract Title</w:t>
       </w:r>
     </w:p>
@@ -81,42 +90,34 @@
         </w:rPr>
       </w:pPr>
       <w:r>
+        <w:rPr/>
         <w:t>Abstract</w:t>
       </w:r>
     </w:p>
     <w:p>
       <w:pPr>
         <w:pStyle w:val="Abstract"/>
+        <w:rPr/>
       </w:pPr>
+      <w:r>
+        <w:rPr/>
+      </w:r>
     </w:p>
     <w:sdt>
       <w:sdtPr>
-        <w:rPr>
-          <w:rFonts w:asciiTheme="minorHAnsi" w:eastAsiaTheme="minorHAnsi" w:hAnsiTheme="minorHAnsi" w:cstheme="minorBidi"/>
-          <w:b w:val="0"/>
-          <w:sz w:val="24"/>
-          <w:szCs w:val="24"/>
-        </w:rPr>
-        <w:id w:val="-202181170"/>
         <w:docPartObj>
           <w:docPartGallery w:val="Table of Contents"/>
-          <w:docPartUnique/>
+          <w:docPartUnique w:val="true"/>
         </w:docPartObj>
       </w:sdtPr>
-      <w:sdtEndPr>
-        <w:rPr>
-          <w:rFonts w:ascii="Proxima Nova Rg" w:eastAsiaTheme="minorEastAsia" w:hAnsi="Proxima Nova Rg" w:cs="Times New Roman (Body CS)"/>
-          <w:bCs/>
-          <w:noProof/>
-          <w:sz w:val="22"/>
-        </w:rPr>
-      </w:sdtEndPr>
       <w:sdtContent>
         <w:p>
           <w:pPr>
             <w:pStyle w:val="TOCHeading"/>
+            <w:rPr/>
           </w:pPr>
           <w:r>
+            <w:rPr/>
             <w:t>Contents</w:t>
           </w:r>
         </w:p>
@@ -124,11 +125,11 @@
           <w:pPr>
             <w:pStyle w:val="TOC1"/>
             <w:tabs>
-              <w:tab w:val="right" w:leader="dot" w:pos="9350"/>
+              <w:tab w:val="clear" w:pos="720"/>
+              <w:tab w:val="right" w:pos="9350" w:leader="dot"/>
             </w:tabs>
             <w:rPr>
-              <w:rFonts w:asciiTheme="minorHAnsi" w:hAnsiTheme="minorHAnsi"/>
-              <w:noProof/>
+              <w:rFonts w:ascii="Cambria" w:hAnsi="Cambria" w:asciiTheme="minorHAnsi" w:hAnsiTheme="minorHAnsi"/>
               <w:kern w:val="2"/>
               <w:lang w:val="en-AU" w:eastAsia="en-AU"/>
             </w:rPr>
@@ -137,63 +138,55 @@
             <w:fldChar w:fldCharType="begin"/>
           </w:r>
           <w:r>
-            <w:instrText xml:space="preserve"> TOC \o "1-3" \h \z \u </w:instrText>
+            <w:rPr>
+              <w:rStyle w:val="IndexLink"/>
+              <w:webHidden/>
+            </w:rPr>
+            <w:instrText xml:space="preserve"> TOC \z \o "1-3" \u \h</w:instrText>
           </w:r>
           <w:r>
+            <w:rPr>
+              <w:rStyle w:val="IndexLink"/>
+              <w:webHidden/>
+            </w:rPr>
             <w:fldChar w:fldCharType="separate"/>
           </w:r>
-          <w:hyperlink w:anchor="_Toc170899675" w:history="1">
+          <w:hyperlink w:anchor="_Toc170899675">
             <w:r>
               <w:rPr>
-                <w:rStyle w:val="Hyperlink"/>
-                <w:noProof/>
+                <w:rStyle w:val="IndexLink"/>
+                <w:webHidden/>
               </w:rPr>
               <w:t>Heading 1</w:t>
             </w:r>
             <w:r>
               <w:rPr>
-                <w:noProof/>
-                <w:webHidden/>
-              </w:rPr>
-              <w:tab/>
-            </w:r>
-            <w:r>
-              <w:rPr>
-                <w:noProof/>
                 <w:webHidden/>
               </w:rPr>
               <w:fldChar w:fldCharType="begin"/>
             </w:r>
             <w:r>
               <w:rPr>
-                <w:noProof/>
                 <w:webHidden/>
               </w:rPr>
-              <w:instrText xml:space="preserve"> PAGEREF _Toc170899675 \h </w:instrText>
+              <w:instrText xml:space="preserve">PAGEREF _Toc170899675 \h</w:instrText>
             </w:r>
             <w:r>
               <w:rPr>
-                <w:noProof/>
-                <w:webHidden/>
-              </w:rPr>
-            </w:r>
-            <w:r>
-              <w:rPr>
-                <w:noProof/>
                 <w:webHidden/>
               </w:rPr>
               <w:fldChar w:fldCharType="separate"/>
             </w:r>
             <w:r>
               <w:rPr>
-                <w:noProof/>
-                <w:webHidden/>
+                <w:rStyle w:val="IndexLink"/>
+                <w:vanish w:val="false"/>
               </w:rPr>
+              <w:tab/>
               <w:t>2</w:t>
             </w:r>
             <w:r>
               <w:rPr>
-                <w:noProof/>
                 <w:webHidden/>
               </w:rPr>
               <w:fldChar w:fldCharType="end"/>
@@ -204,67 +197,51 @@
           <w:pPr>
             <w:pStyle w:val="TOC2"/>
             <w:tabs>
-              <w:tab w:val="right" w:leader="dot" w:pos="9350"/>
+              <w:tab w:val="clear" w:pos="720"/>
+              <w:tab w:val="right" w:pos="9350" w:leader="dot"/>
             </w:tabs>
             <w:rPr>
-              <w:rFonts w:asciiTheme="minorHAnsi" w:hAnsiTheme="minorHAnsi"/>
-              <w:noProof/>
+              <w:rFonts w:ascii="Cambria" w:hAnsi="Cambria" w:asciiTheme="minorHAnsi" w:hAnsiTheme="minorHAnsi"/>
               <w:kern w:val="2"/>
               <w:lang w:val="en-AU" w:eastAsia="en-AU"/>
             </w:rPr>
           </w:pPr>
-          <w:hyperlink w:anchor="_Toc170899676" w:history="1">
+          <w:hyperlink w:anchor="_Toc170899676">
             <w:r>
               <w:rPr>
-                <w:rStyle w:val="Hyperlink"/>
-                <w:noProof/>
+                <w:rStyle w:val="IndexLink"/>
+                <w:webHidden/>
               </w:rPr>
               <w:t>Heading 2</w:t>
             </w:r>
             <w:r>
               <w:rPr>
-                <w:noProof/>
-                <w:webHidden/>
-              </w:rPr>
-              <w:tab/>
-            </w:r>
-            <w:r>
-              <w:rPr>
-                <w:noProof/>
                 <w:webHidden/>
               </w:rPr>
               <w:fldChar w:fldCharType="begin"/>
             </w:r>
             <w:r>
               <w:rPr>
-                <w:noProof/>
                 <w:webHidden/>
               </w:rPr>
-              <w:instrText xml:space="preserve"> PAGEREF _Toc170899676 \h </w:instrText>
+              <w:instrText xml:space="preserve">PAGEREF _Toc170899676 \h</w:instrText>
             </w:r>
             <w:r>
               <w:rPr>
-                <w:noProof/>
-                <w:webHidden/>
-              </w:rPr>
-            </w:r>
-            <w:r>
-              <w:rPr>
-                <w:noProof/>
                 <w:webHidden/>
               </w:rPr>
               <w:fldChar w:fldCharType="separate"/>
             </w:r>
             <w:r>
               <w:rPr>
-                <w:noProof/>
-                <w:webHidden/>
+                <w:rStyle w:val="IndexLink"/>
+                <w:vanish w:val="false"/>
               </w:rPr>
+              <w:tab/>
               <w:t>2</w:t>
             </w:r>
             <w:r>
               <w:rPr>
-                <w:noProof/>
                 <w:webHidden/>
               </w:rPr>
               <w:fldChar w:fldCharType="end"/>
@@ -275,64 +252,47 @@
           <w:pPr>
             <w:pStyle w:val="TOC3"/>
             <w:tabs>
-              <w:tab w:val="right" w:leader="dot" w:pos="9350"/>
+              <w:tab w:val="clear" w:pos="720"/>
+              <w:tab w:val="right" w:pos="9350" w:leader="dot"/>
             </w:tabs>
-            <w:rPr>
-              <w:noProof/>
-            </w:rPr>
+            <w:rPr/>
           </w:pPr>
-          <w:hyperlink w:anchor="_Toc170899677" w:history="1">
+          <w:hyperlink w:anchor="_Toc170899677">
             <w:r>
               <w:rPr>
-                <w:rStyle w:val="Hyperlink"/>
-                <w:noProof/>
+                <w:rStyle w:val="IndexLink"/>
+                <w:webHidden/>
               </w:rPr>
               <w:t>Heading 3</w:t>
             </w:r>
             <w:r>
               <w:rPr>
-                <w:noProof/>
-                <w:webHidden/>
-              </w:rPr>
-              <w:tab/>
-            </w:r>
-            <w:r>
-              <w:rPr>
-                <w:noProof/>
                 <w:webHidden/>
               </w:rPr>
               <w:fldChar w:fldCharType="begin"/>
             </w:r>
             <w:r>
               <w:rPr>
-                <w:noProof/>
                 <w:webHidden/>
               </w:rPr>
-              <w:instrText xml:space="preserve"> PAGEREF _Toc170899677 \h </w:instrText>
+              <w:instrText xml:space="preserve">PAGEREF _Toc170899677 \h</w:instrText>
             </w:r>
             <w:r>
               <w:rPr>
-                <w:noProof/>
-                <w:webHidden/>
-              </w:rPr>
-            </w:r>
-            <w:r>
-              <w:rPr>
-                <w:noProof/>
                 <w:webHidden/>
               </w:rPr>
               <w:fldChar w:fldCharType="separate"/>
             </w:r>
             <w:r>
               <w:rPr>
-                <w:noProof/>
-                <w:webHidden/>
+                <w:rStyle w:val="IndexLink"/>
+                <w:vanish w:val="false"/>
               </w:rPr>
+              <w:tab/>
               <w:t>2</w:t>
             </w:r>
             <w:r>
               <w:rPr>
-                <w:noProof/>
                 <w:webHidden/>
               </w:rPr>
               <w:fldChar w:fldCharType="end"/>
@@ -340,12 +300,15 @@
           </w:hyperlink>
         </w:p>
         <w:p>
+          <w:pPr>
+            <w:pStyle w:val="Normal"/>
+            <w:rPr/>
+          </w:pPr>
           <w:r>
-            <w:rPr>
-              <w:b/>
-              <w:bCs/>
-              <w:noProof/>
-            </w:rPr>
+            <w:rPr/>
+          </w:r>
+          <w:r>
+            <w:rPr/>
             <w:fldChar w:fldCharType="end"/>
           </w:r>
         </w:p>
@@ -354,30 +317,39 @@
     <w:p>
       <w:pPr>
         <w:pStyle w:val="BodyText"/>
+        <w:rPr/>
       </w:pPr>
+      <w:r>
+        <w:rPr/>
+      </w:r>
     </w:p>
     <w:p>
       <w:pPr>
         <w:pStyle w:val="Heading1"/>
+        <w:rPr/>
       </w:pPr>
-      <w:bookmarkStart w:id="0" w:name="_Toc170899675"/>
-      <w:bookmarkStart w:id="1" w:name="heading-1"/>
-      <w:r>
+      <w:bookmarkStart w:id="0" w:name="heading-1"/>
+      <w:bookmarkStart w:id="1" w:name="_Toc170899675"/>
+      <w:r>
+        <w:rPr/>
         <w:t>Heading 1</w:t>
       </w:r>
+      <w:bookmarkEnd w:id="1"/>
+      <w:r>
+        <w:rPr/>
+        <w:t xml:space="preserve"> </w:t>
+      </w:r>
       <w:bookmarkEnd w:id="0"/>
-      <w:r>
-        <w:t xml:space="preserve"> </w:t>
-      </w:r>
-      <w:bookmarkEnd w:id="1"/>
     </w:p>
     <w:p>
       <w:pPr>
         <w:pStyle w:val="Heading2"/>
+        <w:rPr/>
       </w:pPr>
-      <w:bookmarkStart w:id="2" w:name="heading-2"/>
-      <w:bookmarkStart w:id="3" w:name="_Toc170899676"/>
-      <w:r>
+      <w:bookmarkStart w:id="2" w:name="_Toc170899676"/>
+      <w:bookmarkStart w:id="3" w:name="heading-2"/>
+      <w:r>
+        <w:rPr/>
         <w:t>Heading 2</w:t>
       </w:r>
       <w:bookmarkEnd w:id="2"/>
@@ -390,22 +362,22 @@
           <w:color w:val="262625"/>
         </w:rPr>
       </w:pPr>
-      <w:bookmarkStart w:id="4" w:name="_Toc170899677"/>
-      <w:bookmarkStart w:id="5" w:name="heading-3"/>
+      <w:bookmarkStart w:id="4" w:name="heading-3"/>
+      <w:bookmarkStart w:id="5" w:name="_Toc170899677"/>
       <w:r>
         <w:rPr>
           <w:color w:val="262625"/>
         </w:rPr>
         <w:t>Heading 3</w:t>
       </w:r>
+      <w:bookmarkEnd w:id="5"/>
+      <w:r>
+        <w:rPr>
+          <w:color w:val="262625"/>
+        </w:rPr>
+        <w:t xml:space="preserve"> </w:t>
+      </w:r>
       <w:bookmarkEnd w:id="4"/>
-      <w:r>
-        <w:rPr>
-          <w:color w:val="262625"/>
-        </w:rPr>
-        <w:t xml:space="preserve"> </w:t>
-      </w:r>
-      <w:bookmarkEnd w:id="5"/>
     </w:p>
     <w:p>
       <w:pPr>
@@ -514,7 +486,13 @@
         <w:rPr>
           <w:color w:val="262625"/>
         </w:rPr>
-        <w:t xml:space="preserve"> First Paragraph. </w:t>
+        <w:t xml:space="preserve"> </w:t>
+      </w:r>
+      <w:r>
+        <w:rPr>
+          <w:color w:val="262625"/>
+        </w:rPr>
+        <w:t xml:space="preserve">First Paragraph. </w:t>
       </w:r>
     </w:p>
     <w:p>
@@ -528,37 +506,28 @@
         <w:rPr>
           <w:color w:val="262625"/>
         </w:rPr>
-        <w:t xml:space="preserve"> Body Text. Body Text Char.    </w:t>
+        <w:t xml:space="preserve"> </w:t>
+      </w:r>
+      <w:r>
+        <w:rPr>
+          <w:color w:val="262625"/>
+        </w:rPr>
+        <w:t xml:space="preserve">Body Text. Body Text Char.    </w:t>
       </w:r>
       <w:r>
         <w:rPr>
           <w:rStyle w:val="VerbatimChar"/>
           <w:color w:val="262625"/>
         </w:rPr>
-        <w:t xml:space="preserve"> Verbatim </w:t>
-      </w:r>
-      <w:proofErr w:type="gramStart"/>
-      <w:r>
-        <w:rPr>
-          <w:rStyle w:val="VerbatimChar"/>
-          <w:color w:val="262625"/>
-        </w:rPr>
-        <w:t xml:space="preserve">Char </w:t>
-      </w:r>
-      <w:r>
-        <w:rPr>
-          <w:color w:val="262625"/>
-        </w:rPr>
-        <w:t xml:space="preserve"> .</w:t>
-      </w:r>
-      <w:proofErr w:type="gramEnd"/>
-      <w:r>
-        <w:rPr>
-          <w:color w:val="262625"/>
-        </w:rPr>
-        <w:t xml:space="preserve">    </w:t>
-      </w:r>
-      <w:hyperlink r:id="rId17">
+        <w:t xml:space="preserve"> Verbatim Char </w:t>
+      </w:r>
+      <w:r>
+        <w:rPr>
+          <w:color w:val="262625"/>
+        </w:rPr>
+        <w:t xml:space="preserve"> .    </w:t>
+      </w:r>
+      <w:hyperlink r:id="rId8">
         <w:r>
           <w:rPr>
             <w:rStyle w:val="Hyperlink"/>
@@ -578,7 +547,7 @@
           <w:rStyle w:val="FootnoteReference"/>
           <w:color w:val="262625"/>
         </w:rPr>
-        <w:footnoteReference w:id="1"/>
+        <w:footnoteReference w:id="2"/>
       </w:r>
     </w:p>
     <w:p>
@@ -592,13 +561,13 @@
         <w:rPr>
           <w:color w:val="262625"/>
         </w:rPr>
-        <w:t xml:space="preserve"> Block Text. </w:t>
-      </w:r>
-      <w:r>
-        <w:rPr>
-          <w:color w:val="262625"/>
-        </w:rPr>
-        <w:t>nor</w:t>
+        <w:t xml:space="preserve"> </w:t>
+      </w:r>
+      <w:r>
+        <w:rPr>
+          <w:color w:val="262625"/>
+        </w:rPr>
+        <w:t>Block Text. nor</w:t>
       </w:r>
     </w:p>
     <w:p>
@@ -612,14 +581,30 @@
         <w:rPr>
           <w:color w:val="262625"/>
         </w:rPr>
-        <w:t xml:space="preserve"> Table caption. </w:t>
+        <w:t xml:space="preserve"> </w:t>
+      </w:r>
+      <w:r>
+        <w:rPr>
+          <w:color w:val="262625"/>
+        </w:rPr>
+        <w:t xml:space="preserve">Table caption. </w:t>
       </w:r>
     </w:p>
     <w:tbl>
       <w:tblPr>
         <w:tblStyle w:val="Table"/>
-        <w:tblW w:w="0" w:type="auto"/>
-        <w:tblLook w:val="07E0" w:firstRow="1" w:lastRow="1" w:firstColumn="1" w:lastColumn="1" w:noHBand="1" w:noVBand="1"/>
+        <w:tblW w:w="1628" w:type="dxa"/>
+        <w:jc w:val="left"/>
+        <w:tblInd w:w="0" w:type="dxa"/>
+        <w:shd w:fill="FFFFFF" w:val="clear"/>
+        <w:tblLayout w:type="fixed"/>
+        <w:tblCellMar>
+          <w:top w:w="0" w:type="dxa"/>
+          <w:left w:w="108" w:type="dxa"/>
+          <w:bottom w:w="0" w:type="dxa"/>
+          <w:right w:w="108" w:type="dxa"/>
+        </w:tblCellMar>
+        <w:tblLook w:val="07e0" w:noVBand="1" w:noHBand="1" w:lastColumn="1" w:firstColumn="1" w:lastRow="1" w:firstRow="1"/>
       </w:tblPr>
       <w:tblGrid>
         <w:gridCol w:w="814"/>
@@ -631,11 +616,16 @@
         </w:trPr>
         <w:tc>
           <w:tcPr>
-            <w:tcW w:w="0" w:type="auto"/>
+            <w:tcW w:w="814" w:type="dxa"/>
+            <w:tcBorders/>
+            <w:shd w:color="auto" w:fill="FFFFFF" w:themeFill="background1" w:val="clear"/>
           </w:tcPr>
           <w:p>
             <w:pPr>
               <w:pStyle w:val="Compact"/>
+              <w:widowControl/>
+              <w:spacing w:before="36" w:after="36"/>
+              <w:jc w:val="left"/>
               <w:rPr>
                 <w:color w:val="262625"/>
               </w:rPr>
@@ -643,18 +633,33 @@
             <w:r>
               <w:rPr>
                 <w:color w:val="262625"/>
+                <w:szCs w:val="20"/>
+                <w:lang w:val="en-AU" w:eastAsia="en-AU" w:bidi="ar-SA"/>
               </w:rPr>
-              <w:t xml:space="preserve"> Table </w:t>
+              <w:t xml:space="preserve"> </w:t>
+            </w:r>
+            <w:r>
+              <w:rPr>
+                <w:color w:val="262625"/>
+                <w:szCs w:val="20"/>
+                <w:lang w:val="en-AU" w:eastAsia="en-AU" w:bidi="ar-SA"/>
+              </w:rPr>
+              <w:t>Table</w:t>
             </w:r>
           </w:p>
         </w:tc>
         <w:tc>
           <w:tcPr>
-            <w:tcW w:w="0" w:type="auto"/>
+            <w:tcW w:w="814" w:type="dxa"/>
+            <w:tcBorders/>
+            <w:shd w:color="auto" w:fill="FFFFFF" w:themeFill="background1" w:val="clear"/>
           </w:tcPr>
           <w:p>
             <w:pPr>
               <w:pStyle w:val="Compact"/>
+              <w:widowControl/>
+              <w:spacing w:before="36" w:after="36"/>
+              <w:jc w:val="left"/>
               <w:rPr>
                 <w:color w:val="262625"/>
               </w:rPr>
@@ -662,20 +667,36 @@
             <w:r>
               <w:rPr>
                 <w:color w:val="262625"/>
+                <w:szCs w:val="20"/>
+                <w:lang w:val="en-AU" w:eastAsia="en-AU" w:bidi="ar-SA"/>
               </w:rPr>
-              <w:t xml:space="preserve"> Table </w:t>
+              <w:t xml:space="preserve"> </w:t>
+            </w:r>
+            <w:r>
+              <w:rPr>
+                <w:color w:val="262625"/>
+                <w:szCs w:val="20"/>
+                <w:lang w:val="en-AU" w:eastAsia="en-AU" w:bidi="ar-SA"/>
+              </w:rPr>
+              <w:t>Table</w:t>
             </w:r>
           </w:p>
         </w:tc>
       </w:tr>
       <w:tr>
+        <w:trPr/>
         <w:tc>
           <w:tcPr>
-            <w:tcW w:w="0" w:type="auto"/>
+            <w:tcW w:w="814" w:type="dxa"/>
+            <w:tcBorders/>
+            <w:shd w:color="auto" w:fill="FFFFFF" w:themeFill="background1" w:val="clear"/>
           </w:tcPr>
           <w:p>
             <w:pPr>
               <w:pStyle w:val="Compact"/>
+              <w:widowControl/>
+              <w:spacing w:before="36" w:after="36"/>
+              <w:jc w:val="left"/>
               <w:rPr>
                 <w:color w:val="262625"/>
               </w:rPr>
@@ -683,17 +704,33 @@
             <w:r>
               <w:rPr>
                 <w:color w:val="262625"/>
+                <w:szCs w:val="20"/>
+                <w:lang w:val="en-AU" w:eastAsia="en-AU" w:bidi="ar-SA"/>
               </w:rPr>
-              <w:t xml:space="preserve"> 1 </w:t>
+              <w:t xml:space="preserve"> </w:t>
+            </w:r>
+            <w:r>
+              <w:rPr>
+                <w:color w:val="262625"/>
+                <w:szCs w:val="20"/>
+                <w:lang w:val="en-AU" w:eastAsia="en-AU" w:bidi="ar-SA"/>
+              </w:rPr>
+              <w:t>1</w:t>
             </w:r>
           </w:p>
         </w:tc>
         <w:tc>
           <w:tcPr>
-            <w:tcW w:w="0" w:type="auto"/>
+            <w:tcW w:w="814" w:type="dxa"/>
+            <w:tcBorders/>
+            <w:shd w:color="auto" w:fill="FFFFFF" w:themeFill="background1" w:val="clear"/>
           </w:tcPr>
           <w:p>
             <w:pPr>
+              <w:pStyle w:val="Normal"/>
+              <w:widowControl/>
+              <w:spacing w:before="0" w:after="200"/>
+              <w:jc w:val="left"/>
               <w:rPr>
                 <w:color w:val="262625"/>
               </w:rPr>
@@ -701,8 +738,20 @@
             <w:r>
               <w:rPr>
                 <w:color w:val="262625"/>
+                <w:sz w:val="20"/>
+                <w:szCs w:val="20"/>
+                <w:lang w:val="en-AU" w:eastAsia="en-AU" w:bidi="ar-SA"/>
               </w:rPr>
-              <w:t xml:space="preserve"> 2 </w:t>
+              <w:t xml:space="preserve"> </w:t>
+            </w:r>
+            <w:r>
+              <w:rPr>
+                <w:color w:val="262625"/>
+                <w:sz w:val="20"/>
+                <w:szCs w:val="20"/>
+                <w:lang w:val="en-AU" w:eastAsia="en-AU" w:bidi="ar-SA"/>
+              </w:rPr>
+              <w:t>2</w:t>
             </w:r>
           </w:p>
         </w:tc>
@@ -741,19 +790,11 @@
         </w:rPr>
         <w:t xml:space="preserve"> </w:t>
       </w:r>
-      <w:proofErr w:type="spellStart"/>
-      <w:r>
-        <w:rPr>
-          <w:color w:val="262625"/>
-        </w:rPr>
-        <w:t>DefinitionTerm</w:t>
-      </w:r>
-      <w:proofErr w:type="spellEnd"/>
-      <w:r>
-        <w:rPr>
-          <w:color w:val="262625"/>
-        </w:rPr>
-        <w:t xml:space="preserve"> </w:t>
+      <w:r>
+        <w:rPr>
+          <w:color w:val="262625"/>
+        </w:rPr>
+        <w:t xml:space="preserve">DefinitionTerm </w:t>
       </w:r>
     </w:p>
     <w:p>
@@ -767,7 +808,13 @@
         <w:rPr>
           <w:color w:val="262625"/>
         </w:rPr>
-        <w:t xml:space="preserve"> Definition </w:t>
+        <w:t xml:space="preserve"> </w:t>
+      </w:r>
+      <w:r>
+        <w:rPr>
+          <w:color w:val="262625"/>
+        </w:rPr>
+        <w:t xml:space="preserve">Definition </w:t>
       </w:r>
     </w:p>
     <w:p>
@@ -783,19 +830,11 @@
         </w:rPr>
         <w:t xml:space="preserve"> </w:t>
       </w:r>
-      <w:proofErr w:type="spellStart"/>
-      <w:r>
-        <w:rPr>
-          <w:color w:val="262625"/>
-        </w:rPr>
-        <w:t>DefinitionTerm</w:t>
-      </w:r>
-      <w:proofErr w:type="spellEnd"/>
-      <w:r>
-        <w:rPr>
-          <w:color w:val="262625"/>
-        </w:rPr>
-        <w:t xml:space="preserve"> </w:t>
+      <w:r>
+        <w:rPr>
+          <w:color w:val="262625"/>
+        </w:rPr>
+        <w:t xml:space="preserve">DefinitionTerm </w:t>
       </w:r>
     </w:p>
     <w:p>
@@ -809,74 +848,74 @@
         <w:rPr>
           <w:color w:val="262625"/>
         </w:rPr>
-        <w:t xml:space="preserve"> Definition</w:t>
+        <w:t xml:space="preserve"> </w:t>
+      </w:r>
+      <w:r>
+        <w:rPr>
+          <w:color w:val="262625"/>
+        </w:rPr>
+        <w:t>Definition</w:t>
       </w:r>
     </w:p>
     <w:p>
       <w:pPr>
         <w:pStyle w:val="Definition"/>
+        <w:spacing w:before="0" w:after="200"/>
+        <w:rPr/>
       </w:pPr>
+      <w:r>
+        <w:rPr/>
+      </w:r>
     </w:p>
     <w:sectPr>
-      <w:pgSz w:w="11900" w:h="16840" w:code="9"/>
-      <w:pgMar w:top="1440" w:right="1077" w:bottom="1440" w:left="1077" w:header="567" w:footer="567" w:gutter="0"/>
-      <w:pgNumType w:start="0"/>
-      <w:cols w:space="720"/>
-      <w:docGrid w:linePitch="326"/>
+      <w:headerReference w:type="default" r:id="rId9"/>
+      <w:headerReference w:type="first" r:id="rId10"/>
+      <w:footerReference w:type="default" r:id="rId11"/>
+      <w:footerReference w:type="first" r:id="rId12"/>
+      <w:footnotePr>
+        <w:numFmt w:val="decimal"/>
+      </w:footnotePr>
+      <w:type w:val="nextPage"/>
+      <w:pgSz w:w="11906" w:h="16838"/>
+      <w:pgMar w:left="1077" w:right="1077" w:gutter="0" w:header="567" w:top="1440" w:footer="567" w:bottom="1440"/>
+      <w:pgNumType w:start="0" w:fmt="decimal"/>
+      <w:formProt w:val="false"/>
+      <w:textDirection w:val="lrTb"/>
+      <w:docGrid w:type="default" w:linePitch="326" w:charSpace="0"/>
     </w:sectPr>
   </w:body>
 </w:document>
 </file>
 
-<file path=word/endnotes.xml><?xml version="1.0" encoding="utf-8"?>
-<w:endnotes xmlns:wpc="http://schemas.microsoft.com/office/word/2010/wordprocessingCanvas" xmlns:cx="http://schemas.microsoft.com/office/drawing/2014/chartex" xmlns:cx1="http://schemas.microsoft.com/office/drawing/2015/9/8/chartex" xmlns:cx2="http://schemas.microsoft.com/office/drawing/2015/10/21/chartex" xmlns:cx3="http://schemas.microsoft.com/office/drawing/2016/5/9/chartex" xmlns:cx4="http://schemas.microsoft.com/office/drawing/2016/5/10/chartex" xmlns:cx5="http://schemas.microsoft.com/office/drawing/2016/5/11/chartex" xmlns:cx6="http://schemas.microsoft.com/office/drawing/2016/5/12/chartex" xmlns:cx7="http://schemas.microsoft.com/office/drawing/2016/5/13/chartex" xmlns:cx8="http://schemas.microsoft.com/office/drawing/2016/5/14/chartex" xmlns:mc="http://schemas.openxmlformats.org/markup-compatibility/2006" xmlns:aink="http://schemas.microsoft.com/office/drawing/2016/ink" xmlns:am3d="http://schemas.microsoft.com/office/drawing/2017/model3d" xmlns:o="urn:schemas-microsoft-com:office:office" xmlns:oel="http://schemas.microsoft.com/office/2019/extlst" xmlns:r="http://schemas.openxmlformats.org/officeDocument/2006/relationships" xmlns:m="http://schemas.openxmlformats.org/officeDocument/2006/math" xmlns:v="urn:schemas-microsoft-com:vml" xmlns:wp14="http://schemas.microsoft.com/office/word/2010/wordprocessingDrawing" xmlns:wp="http://schemas.openxmlformats.org/drawingml/2006/wordprocessingDrawing" xmlns:w10="urn:schemas-microsoft-com:office:word" xmlns:w="http://schemas.openxmlformats.org/wordprocessingml/2006/main" xmlns:w14="http://schemas.microsoft.com/office/word/2010/wordml" xmlns:w15="http://schemas.microsoft.com/office/word/2012/wordml" xmlns:w16cex="http://schemas.microsoft.com/office/word/2018/wordml/cex" xmlns:w16cid="http://schemas.microsoft.com/office/word/2016/wordml/cid" xmlns:w16="http://schemas.microsoft.com/office/word/2018/wordml" xmlns:w16du="http://schemas.microsoft.com/office/word/2023/wordml/word16du" xmlns:w16sdtdh="http://schemas.microsoft.com/office/word/2020/wordml/sdtdatahash" xmlns:w16sdtfl="http://schemas.microsoft.com/office/word/2024/wordml/sdtformatlock" xmlns:w16se="http://schemas.microsoft.com/office/word/2015/wordml/symex" xmlns:wpg="http://schemas.microsoft.com/office/word/2010/wordprocessingGroup" xmlns:wpi="http://schemas.microsoft.com/office/word/2010/wordprocessingInk" xmlns:wne="http://schemas.microsoft.com/office/word/2006/wordml" xmlns:wps="http://schemas.microsoft.com/office/word/2010/wordprocessingShape" mc:Ignorable="w14 w15 w16se w16cid w16 w16cex w16sdtdh w16sdtfl w16du wp14">
-  <w:endnote w:type="separator" w:id="-1">
-    <w:p>
-      <w:pPr>
-        <w:spacing w:after="0"/>
-      </w:pPr>
-      <w:r>
-        <w:separator/>
-      </w:r>
-    </w:p>
-  </w:endnote>
-  <w:endnote w:type="continuationSeparator" w:id="0">
-    <w:p>
-      <w:pPr>
-        <w:spacing w:after="0"/>
-      </w:pPr>
-      <w:r>
-        <w:continuationSeparator/>
-      </w:r>
-    </w:p>
-  </w:endnote>
-</w:endnotes>
-</file>
-
 <file path=word/footer1.xml><?xml version="1.0" encoding="utf-8"?>
-<w:ftr xmlns:wpc="http://schemas.microsoft.com/office/word/2010/wordprocessingCanvas" xmlns:cx="http://schemas.microsoft.com/office/drawing/2014/chartex" xmlns:cx1="http://schemas.microsoft.com/office/drawing/2015/9/8/chartex" xmlns:cx2="http://schemas.microsoft.com/office/drawing/2015/10/21/chartex" xmlns:cx3="http://schemas.microsoft.com/office/drawing/2016/5/9/chartex" xmlns:cx4="http://schemas.microsoft.com/office/drawing/2016/5/10/chartex" xmlns:cx5="http://schemas.microsoft.com/office/drawing/2016/5/11/chartex" xmlns:cx6="http://schemas.microsoft.com/office/drawing/2016/5/12/chartex" xmlns:cx7="http://schemas.microsoft.com/office/drawing/2016/5/13/chartex" xmlns:cx8="http://schemas.microsoft.com/office/drawing/2016/5/14/chartex" xmlns:mc="http://schemas.openxmlformats.org/markup-compatibility/2006" xmlns:aink="http://schemas.microsoft.com/office/drawing/2016/ink" xmlns:am3d="http://schemas.microsoft.com/office/drawing/2017/model3d" xmlns:o="urn:schemas-microsoft-com:office:office" xmlns:oel="http://schemas.microsoft.com/office/2019/extlst" xmlns:r="http://schemas.openxmlformats.org/officeDocument/2006/relationships" xmlns:m="http://schemas.openxmlformats.org/officeDocument/2006/math" xmlns:v="urn:schemas-microsoft-com:vml" xmlns:wp14="http://schemas.microsoft.com/office/word/2010/wordprocessingDrawing" xmlns:wp="http://schemas.openxmlformats.org/drawingml/2006/wordprocessingDrawing" xmlns:w10="urn:schemas-microsoft-com:office:word" xmlns:w="http://schemas.openxmlformats.org/wordprocessingml/2006/main" xmlns:w14="http://schemas.microsoft.com/office/word/2010/wordml" xmlns:w15="http://schemas.microsoft.com/office/word/2012/wordml" xmlns:w16cex="http://schemas.microsoft.com/office/word/2018/wordml/cex" xmlns:w16cid="http://schemas.microsoft.com/office/word/2016/wordml/cid" xmlns:w16="http://schemas.microsoft.com/office/word/2018/wordml" xmlns:w16du="http://schemas.microsoft.com/office/word/2023/wordml/word16du" xmlns:w16sdtdh="http://schemas.microsoft.com/office/word/2020/wordml/sdtdatahash" xmlns:w16sdtfl="http://schemas.microsoft.com/office/word/2024/wordml/sdtformatlock" xmlns:w16se="http://schemas.microsoft.com/office/word/2015/wordml/symex" xmlns:wpg="http://schemas.microsoft.com/office/word/2010/wordprocessingGroup" xmlns:wpi="http://schemas.microsoft.com/office/word/2010/wordprocessingInk" xmlns:wne="http://schemas.microsoft.com/office/word/2006/wordml" xmlns:wps="http://schemas.microsoft.com/office/word/2010/wordprocessingShape" mc:Ignorable="w14 w15 w16se w16cid w16 w16cex w16sdtdh w16sdtfl w16du wp14">
+<w:ftr xmlns:o="urn:schemas-microsoft-com:office:office" xmlns:r="http://schemas.openxmlformats.org/officeDocument/2006/relationships" xmlns:v="urn:schemas-microsoft-com:vml" xmlns:w="http://schemas.openxmlformats.org/wordprocessingml/2006/main" xmlns:w10="urn:schemas-microsoft-com:office:word" xmlns:wp="http://schemas.openxmlformats.org/drawingml/2006/wordprocessingDrawing" xmlns:pic="http://schemas.openxmlformats.org/drawingml/2006/picture" xmlns:wps="http://schemas.microsoft.com/office/word/2010/wordprocessingShape" xmlns:wpg="http://schemas.microsoft.com/office/word/2010/wordprocessingGroup" xmlns:mc="http://schemas.openxmlformats.org/markup-compatibility/2006" xmlns:wp14="http://schemas.microsoft.com/office/word/2010/wordprocessingDrawing" xmlns:w14="http://schemas.microsoft.com/office/word/2010/wordml" xmlns:w15="http://schemas.microsoft.com/office/word/2012/wordml" mc:Ignorable="w14 wp14 w15">
   <w:p>
     <w:pPr>
       <w:pStyle w:val="Footer"/>
-    </w:pPr>
+      <w:rPr/>
+    </w:pPr>
+    <w:r>
+      <w:rPr/>
+    </w:r>
   </w:p>
 </w:ftr>
 </file>
 
 <file path=word/footer2.xml><?xml version="1.0" encoding="utf-8"?>
-<w:ftr xmlns:wpc="http://schemas.microsoft.com/office/word/2010/wordprocessingCanvas" xmlns:cx="http://schemas.microsoft.com/office/drawing/2014/chartex" xmlns:cx1="http://schemas.microsoft.com/office/drawing/2015/9/8/chartex" xmlns:cx2="http://schemas.microsoft.com/office/drawing/2015/10/21/chartex" xmlns:cx3="http://schemas.microsoft.com/office/drawing/2016/5/9/chartex" xmlns:cx4="http://schemas.microsoft.com/office/drawing/2016/5/10/chartex" xmlns:cx5="http://schemas.microsoft.com/office/drawing/2016/5/11/chartex" xmlns:cx6="http://schemas.microsoft.com/office/drawing/2016/5/12/chartex" xmlns:cx7="http://schemas.microsoft.com/office/drawing/2016/5/13/chartex" xmlns:cx8="http://schemas.microsoft.com/office/drawing/2016/5/14/chartex" xmlns:mc="http://schemas.openxmlformats.org/markup-compatibility/2006" xmlns:aink="http://schemas.microsoft.com/office/drawing/2016/ink" xmlns:am3d="http://schemas.microsoft.com/office/drawing/2017/model3d" xmlns:o="urn:schemas-microsoft-com:office:office" xmlns:oel="http://schemas.microsoft.com/office/2019/extlst" xmlns:r="http://schemas.openxmlformats.org/officeDocument/2006/relationships" xmlns:m="http://schemas.openxmlformats.org/officeDocument/2006/math" xmlns:v="urn:schemas-microsoft-com:vml" xmlns:wp14="http://schemas.microsoft.com/office/word/2010/wordprocessingDrawing" xmlns:wp="http://schemas.openxmlformats.org/drawingml/2006/wordprocessingDrawing" xmlns:w10="urn:schemas-microsoft-com:office:word" xmlns:w="http://schemas.openxmlformats.org/wordprocessingml/2006/main" xmlns:w14="http://schemas.microsoft.com/office/word/2010/wordml" xmlns:w15="http://schemas.microsoft.com/office/word/2012/wordml" xmlns:w16cex="http://schemas.microsoft.com/office/word/2018/wordml/cex" xmlns:w16cid="http://schemas.microsoft.com/office/word/2016/wordml/cid" xmlns:w16="http://schemas.microsoft.com/office/word/2018/wordml" xmlns:w16du="http://schemas.microsoft.com/office/word/2023/wordml/word16du" xmlns:w16sdtdh="http://schemas.microsoft.com/office/word/2020/wordml/sdtdatahash" xmlns:w16sdtfl="http://schemas.microsoft.com/office/word/2024/wordml/sdtformatlock" xmlns:w16se="http://schemas.microsoft.com/office/word/2015/wordml/symex" xmlns:wpg="http://schemas.microsoft.com/office/word/2010/wordprocessingGroup" xmlns:wpi="http://schemas.microsoft.com/office/word/2010/wordprocessingInk" xmlns:wne="http://schemas.microsoft.com/office/word/2006/wordml" xmlns:wps="http://schemas.microsoft.com/office/word/2010/wordprocessingShape" mc:Ignorable="w14 w15 w16se w16cid w16 w16cex w16sdtdh w16sdtfl w16du wp14">
+<w:ftr xmlns:o="urn:schemas-microsoft-com:office:office" xmlns:r="http://schemas.openxmlformats.org/officeDocument/2006/relationships" xmlns:v="urn:schemas-microsoft-com:vml" xmlns:w="http://schemas.openxmlformats.org/wordprocessingml/2006/main" xmlns:w10="urn:schemas-microsoft-com:office:word" xmlns:wp="http://schemas.openxmlformats.org/drawingml/2006/wordprocessingDrawing" xmlns:pic="http://schemas.openxmlformats.org/drawingml/2006/picture" xmlns:wps="http://schemas.microsoft.com/office/word/2010/wordprocessingShape" xmlns:wpg="http://schemas.microsoft.com/office/word/2010/wordprocessingGroup" xmlns:mc="http://schemas.openxmlformats.org/markup-compatibility/2006" xmlns:wp14="http://schemas.microsoft.com/office/word/2010/wordprocessingDrawing" xmlns:w14="http://schemas.microsoft.com/office/word/2010/wordml" xmlns:w15="http://schemas.microsoft.com/office/word/2012/wordml" mc:Ignorable="w14 wp14 w15">
   <w:p>
     <w:pPr>
       <w:pStyle w:val="Footer"/>
       <w:jc w:val="center"/>
+      <w:rPr/>
     </w:pPr>
     <w:r>
+      <w:rPr/>
       <w:t xml:space="preserve">Contact email: </w:t>
     </w:r>
     <w:sdt>
       <w:sdtPr>
         <w:alias w:val="Subject"/>
-        <w:tag w:val=""/>
         <w:id w:val="738907193"/>
         <w:placeholder>
           <w:docPart w:val="F0D219317E45413384D448372B8648C7"/>
@@ -887,6 +926,9 @@
       </w:sdtPr>
       <w:sdtContent>
         <w:r>
+          <w:rPr/>
+        </w:r>
+        <w:r>
           <w:rPr>
             <w:rStyle w:val="PlaceholderText"/>
           </w:rPr>
@@ -895,50 +937,63 @@
       </w:sdtContent>
     </w:sdt>
     <w:r>
-      <w:ptab w:relativeTo="margin" w:alignment="center" w:leader="none"/>
+      <w:rPr/>
+      <w:tab/>
     </w:r>
     <w:r>
+      <w:rPr/>
       <w:fldChar w:fldCharType="begin"/>
     </w:r>
     <w:r>
-      <w:instrText xml:space="preserve"> PAGE   \* MERGEFORMAT </w:instrText>
+      <w:rPr/>
+      <w:instrText xml:space="preserve"> PAGE </w:instrText>
     </w:r>
     <w:r>
+      <w:rPr/>
       <w:fldChar w:fldCharType="separate"/>
     </w:r>
     <w:r>
-      <w:rPr>
-        <w:noProof/>
-      </w:rPr>
-      <w:t>1</w:t>
+      <w:rPr/>
+      <w:t>0</w:t>
     </w:r>
     <w:r>
+      <w:rPr/>
       <w:fldChar w:fldCharType="end"/>
     </w:r>
     <w:r>
-      <w:ptab w:relativeTo="margin" w:alignment="right" w:leader="none"/>
+      <w:rPr/>
+      <w:tab/>
     </w:r>
   </w:p>
 </w:ftr>
 </file>
 
 <file path=word/footer3.xml><?xml version="1.0" encoding="utf-8"?>
-<w:ftr xmlns:wpc="http://schemas.microsoft.com/office/word/2010/wordprocessingCanvas" xmlns:cx="http://schemas.microsoft.com/office/drawing/2014/chartex" xmlns:cx1="http://schemas.microsoft.com/office/drawing/2015/9/8/chartex" xmlns:cx2="http://schemas.microsoft.com/office/drawing/2015/10/21/chartex" xmlns:cx3="http://schemas.microsoft.com/office/drawing/2016/5/9/chartex" xmlns:cx4="http://schemas.microsoft.com/office/drawing/2016/5/10/chartex" xmlns:cx5="http://schemas.microsoft.com/office/drawing/2016/5/11/chartex" xmlns:cx6="http://schemas.microsoft.com/office/drawing/2016/5/12/chartex" xmlns:cx7="http://schemas.microsoft.com/office/drawing/2016/5/13/chartex" xmlns:cx8="http://schemas.microsoft.com/office/drawing/2016/5/14/chartex" xmlns:mc="http://schemas.openxmlformats.org/markup-compatibility/2006" xmlns:aink="http://schemas.microsoft.com/office/drawing/2016/ink" xmlns:am3d="http://schemas.microsoft.com/office/drawing/2017/model3d" xmlns:o="urn:schemas-microsoft-com:office:office" xmlns:oel="http://schemas.microsoft.com/office/2019/extlst" xmlns:r="http://schemas.openxmlformats.org/officeDocument/2006/relationships" xmlns:m="http://schemas.openxmlformats.org/officeDocument/2006/math" xmlns:v="urn:schemas-microsoft-com:vml" xmlns:wp14="http://schemas.microsoft.com/office/word/2010/wordprocessingDrawing" xmlns:wp="http://schemas.openxmlformats.org/drawingml/2006/wordprocessingDrawing" xmlns:w10="urn:schemas-microsoft-com:office:word" xmlns:w="http://schemas.openxmlformats.org/wordprocessingml/2006/main" xmlns:w14="http://schemas.microsoft.com/office/word/2010/wordml" xmlns:w15="http://schemas.microsoft.com/office/word/2012/wordml" xmlns:w16cex="http://schemas.microsoft.com/office/word/2018/wordml/cex" xmlns:w16cid="http://schemas.microsoft.com/office/word/2016/wordml/cid" xmlns:w16="http://schemas.microsoft.com/office/word/2018/wordml" xmlns:w16du="http://schemas.microsoft.com/office/word/2023/wordml/word16du" xmlns:w16sdtdh="http://schemas.microsoft.com/office/word/2020/wordml/sdtdatahash" xmlns:w16sdtfl="http://schemas.microsoft.com/office/word/2024/wordml/sdtformatlock" xmlns:w16se="http://schemas.microsoft.com/office/word/2015/wordml/symex" xmlns:wpg="http://schemas.microsoft.com/office/word/2010/wordprocessingGroup" xmlns:wpi="http://schemas.microsoft.com/office/word/2010/wordprocessingInk" xmlns:wne="http://schemas.microsoft.com/office/word/2006/wordml" xmlns:wps="http://schemas.microsoft.com/office/word/2010/wordprocessingShape" mc:Ignorable="w14 w15 w16se w16cid w16 w16cex w16sdtdh w16sdtfl w16du wp14">
+<w:ftr xmlns:o="urn:schemas-microsoft-com:office:office" xmlns:r="http://schemas.openxmlformats.org/officeDocument/2006/relationships" xmlns:v="urn:schemas-microsoft-com:vml" xmlns:w="http://schemas.openxmlformats.org/wordprocessingml/2006/main" xmlns:w10="urn:schemas-microsoft-com:office:word" xmlns:wp="http://schemas.openxmlformats.org/drawingml/2006/wordprocessingDrawing" xmlns:pic="http://schemas.openxmlformats.org/drawingml/2006/picture" xmlns:wps="http://schemas.microsoft.com/office/word/2010/wordprocessingShape" xmlns:wpg="http://schemas.microsoft.com/office/word/2010/wordprocessingGroup" xmlns:mc="http://schemas.openxmlformats.org/markup-compatibility/2006" xmlns:wp14="http://schemas.microsoft.com/office/word/2010/wordprocessingDrawing" xmlns:w14="http://schemas.microsoft.com/office/word/2010/wordml" xmlns:w15="http://schemas.microsoft.com/office/word/2012/wordml" mc:Ignorable="w14 wp14 w15">
   <w:tbl>
     <w:tblPr>
       <w:tblStyle w:val="TableGrid"/>
       <w:tblW w:w="10148" w:type="dxa"/>
-      <w:tblLook w:val="04A0" w:firstRow="1" w:lastRow="0" w:firstColumn="1" w:lastColumn="0" w:noHBand="0" w:noVBand="1"/>
+      <w:jc w:val="left"/>
+      <w:tblInd w:w="0" w:type="dxa"/>
+      <w:tblLayout w:type="fixed"/>
+      <w:tblCellMar>
+        <w:top w:w="0" w:type="dxa"/>
+        <w:left w:w="108" w:type="dxa"/>
+        <w:bottom w:w="0" w:type="dxa"/>
+        <w:right w:w="108" w:type="dxa"/>
+      </w:tblCellMar>
+      <w:tblLook w:val="04a0" w:noVBand="1" w:noHBand="0" w:lastColumn="0" w:firstColumn="1" w:lastRow="0" w:firstRow="1"/>
     </w:tblPr>
     <w:tblGrid>
       <w:gridCol w:w="10148"/>
     </w:tblGrid>
     <w:tr>
+      <w:trPr/>
       <w:tc>
         <w:tcPr>
           <w:tcW w:w="10148" w:type="dxa"/>
           <w:tcBorders>
-            <w:top w:val="single" w:sz="4" w:space="0" w:color="auto"/>
             <w:left w:val="nil"/>
             <w:bottom w:val="nil"/>
             <w:right w:val="nil"/>
@@ -947,20 +1002,23 @@
         <w:p>
           <w:pPr>
             <w:pStyle w:val="Footer"/>
-            <w:spacing w:after="100" w:afterAutospacing="1"/>
+            <w:widowControl/>
+            <w:spacing w:before="0" w:after="0"/>
+            <w:jc w:val="left"/>
             <w:rPr>
               <w:lang w:val="en-AU"/>
             </w:rPr>
           </w:pPr>
           <w:r>
             <w:rPr>
-              <w:noProof/>
+              <w:szCs w:val="24"/>
+              <w:lang w:eastAsia="en-US" w:bidi="ar-SA"/>
             </w:rPr>
             <w:drawing>
-              <wp:inline distT="0" distB="0" distL="0" distR="0" wp14:anchorId="282D0742" wp14:editId="520E67A7">
-                <wp:extent cx="6004737" cy="712426"/>
+              <wp:inline distT="0" distB="0" distL="0" distR="0">
+                <wp:extent cx="6004560" cy="712470"/>
                 <wp:effectExtent l="0" t="0" r="0" b="0"/>
-                <wp:docPr id="2111839618" name="Picture 3"/>
+                <wp:docPr id="2" name="Picture 3"/>
                 <wp:cNvGraphicFramePr>
                   <a:graphicFrameLocks xmlns:a="http://schemas.openxmlformats.org/drawingml/2006/main" noChangeAspect="1"/>
                 </wp:cNvGraphicFramePr>
@@ -968,29 +1026,26 @@
                   <a:graphicData uri="http://schemas.openxmlformats.org/drawingml/2006/picture">
                     <pic:pic xmlns:pic="http://schemas.openxmlformats.org/drawingml/2006/picture">
                       <pic:nvPicPr>
-                        <pic:cNvPr id="2111839618" name="Picture 3"/>
-                        <pic:cNvPicPr/>
+                        <pic:cNvPr id="2" name="Picture 3"/>
+                        <pic:cNvPicPr>
+                          <a:picLocks noChangeAspect="1" noChangeArrowheads="1"/>
+                        </pic:cNvPicPr>
                       </pic:nvPicPr>
                       <pic:blipFill>
-                        <a:blip r:embed="rId1">
-                          <a:extLst>
-                            <a:ext uri="{28A0092B-C50C-407E-A947-70E740481C1C}">
-                              <a14:useLocalDpi xmlns:a14="http://schemas.microsoft.com/office/drawing/2010/main" val="0"/>
-                            </a:ext>
-                          </a:extLst>
-                        </a:blip>
+                        <a:blip r:embed="rId1"/>
                         <a:stretch>
                           <a:fillRect/>
                         </a:stretch>
                       </pic:blipFill>
-                      <pic:spPr>
+                      <pic:spPr bwMode="auto">
                         <a:xfrm>
                           <a:off x="0" y="0"/>
-                          <a:ext cx="6004737" cy="712426"/>
+                          <a:ext cx="6004560" cy="712470"/>
                         </a:xfrm>
                         <a:prstGeom prst="rect">
                           <a:avLst/>
                         </a:prstGeom>
+                        <a:noFill/>
                       </pic:spPr>
                     </pic:pic>
                   </a:graphicData>
@@ -1009,39 +1064,124 @@
         <w:lang w:val="en-AU"/>
       </w:rPr>
     </w:pPr>
+    <w:r>
+      <w:rPr>
+        <w:lang w:val="en-AU"/>
+      </w:rPr>
+    </w:r>
   </w:p>
 </w:ftr>
 </file>
 
+<file path=word/footer4.xml><?xml version="1.0" encoding="utf-8"?>
+<w:ftr xmlns:o="urn:schemas-microsoft-com:office:office" xmlns:r="http://schemas.openxmlformats.org/officeDocument/2006/relationships" xmlns:v="urn:schemas-microsoft-com:vml" xmlns:w="http://schemas.openxmlformats.org/wordprocessingml/2006/main" xmlns:w10="urn:schemas-microsoft-com:office:word" xmlns:wp="http://schemas.openxmlformats.org/drawingml/2006/wordprocessingDrawing" xmlns:pic="http://schemas.openxmlformats.org/drawingml/2006/picture" xmlns:wps="http://schemas.microsoft.com/office/word/2010/wordprocessingShape" xmlns:wpg="http://schemas.microsoft.com/office/word/2010/wordprocessingGroup" xmlns:mc="http://schemas.openxmlformats.org/markup-compatibility/2006" xmlns:wp14="http://schemas.microsoft.com/office/word/2010/wordprocessingDrawing" xmlns:w14="http://schemas.microsoft.com/office/word/2010/wordml" xmlns:w15="http://schemas.microsoft.com/office/word/2012/wordml" mc:Ignorable="w14 wp14 w15">
+  <w:p>
+    <w:pPr>
+      <w:pStyle w:val="Footer"/>
+      <w:jc w:val="center"/>
+      <w:rPr/>
+    </w:pPr>
+    <w:r>
+      <w:rPr/>
+      <w:t xml:space="preserve">Contact email: </w:t>
+    </w:r>
+    <w:sdt>
+      <w:sdtPr>
+        <w:alias w:val="Subject"/>
+        <w:id w:val="738907193"/>
+        <w:placeholder>
+          <w:docPart w:val="F0D219317E45413384D448372B8648C7"/>
+        </w:placeholder>
+        <w:showingPlcHdr/>
+        <w:dataBinding w:prefixMappings="xmlns:ns0='http://purl.org/dc/elements/1.1/' xmlns:ns1='http://schemas.openxmlformats.org/package/2006/metadata/core-properties' " w:xpath="/ns1:coreProperties[1]/ns0:subject[1]" w:storeItemID="{6C3C8BC8-F283-45AE-878A-BAB7291924A1}"/>
+        <w:text/>
+      </w:sdtPr>
+      <w:sdtContent>
+        <w:r>
+          <w:rPr/>
+        </w:r>
+        <w:r>
+          <w:rPr>
+            <w:rStyle w:val="PlaceholderText"/>
+          </w:rPr>
+          <w:t>[Subject]</w:t>
+        </w:r>
+      </w:sdtContent>
+    </w:sdt>
+    <w:r>
+      <w:rPr/>
+      <w:tab/>
+    </w:r>
+    <w:r>
+      <w:rPr/>
+      <w:fldChar w:fldCharType="begin"/>
+    </w:r>
+    <w:r>
+      <w:rPr/>
+      <w:instrText xml:space="preserve"> PAGE </w:instrText>
+    </w:r>
+    <w:r>
+      <w:rPr/>
+      <w:fldChar w:fldCharType="separate"/>
+    </w:r>
+    <w:r>
+      <w:rPr/>
+      <w:t>1</w:t>
+    </w:r>
+    <w:r>
+      <w:rPr/>
+      <w:fldChar w:fldCharType="end"/>
+    </w:r>
+    <w:r>
+      <w:rPr/>
+      <w:tab/>
+    </w:r>
+  </w:p>
+</w:ftr>
+</file>
+
+<file path=word/footer5.xml><?xml version="1.0" encoding="utf-8"?>
+<w:ftr xmlns:o="urn:schemas-microsoft-com:office:office" xmlns:r="http://schemas.openxmlformats.org/officeDocument/2006/relationships" xmlns:v="urn:schemas-microsoft-com:vml" xmlns:w="http://schemas.openxmlformats.org/wordprocessingml/2006/main" xmlns:w10="urn:schemas-microsoft-com:office:word" xmlns:wp="http://schemas.openxmlformats.org/drawingml/2006/wordprocessingDrawing" xmlns:pic="http://schemas.openxmlformats.org/drawingml/2006/picture" xmlns:wps="http://schemas.microsoft.com/office/word/2010/wordprocessingShape" xmlns:wpg="http://schemas.microsoft.com/office/word/2010/wordprocessingGroup" xmlns:mc="http://schemas.openxmlformats.org/markup-compatibility/2006" xmlns:wp14="http://schemas.microsoft.com/office/word/2010/wordprocessingDrawing" xmlns:w14="http://schemas.microsoft.com/office/word/2010/wordml" xmlns:w15="http://schemas.microsoft.com/office/word/2012/wordml" mc:Ignorable="w14 wp14 w15">
+  <w:p/>
+</w:ftr>
+</file>
+
 <file path=word/footnotes.xml><?xml version="1.0" encoding="utf-8"?>
-<w:footnotes xmlns:wpc="http://schemas.microsoft.com/office/word/2010/wordprocessingCanvas" xmlns:cx="http://schemas.microsoft.com/office/drawing/2014/chartex" xmlns:cx1="http://schemas.microsoft.com/office/drawing/2015/9/8/chartex" xmlns:cx2="http://schemas.microsoft.com/office/drawing/2015/10/21/chartex" xmlns:cx3="http://schemas.microsoft.com/office/drawing/2016/5/9/chartex" xmlns:cx4="http://schemas.microsoft.com/office/drawing/2016/5/10/chartex" xmlns:cx5="http://schemas.microsoft.com/office/drawing/2016/5/11/chartex" xmlns:cx6="http://schemas.microsoft.com/office/drawing/2016/5/12/chartex" xmlns:cx7="http://schemas.microsoft.com/office/drawing/2016/5/13/chartex" xmlns:cx8="http://schemas.microsoft.com/office/drawing/2016/5/14/chartex" xmlns:mc="http://schemas.openxmlformats.org/markup-compatibility/2006" xmlns:aink="http://schemas.microsoft.com/office/drawing/2016/ink" xmlns:am3d="http://schemas.microsoft.com/office/drawing/2017/model3d" xmlns:o="urn:schemas-microsoft-com:office:office" xmlns:oel="http://schemas.microsoft.com/office/2019/extlst" xmlns:r="http://schemas.openxmlformats.org/officeDocument/2006/relationships" xmlns:m="http://schemas.openxmlformats.org/officeDocument/2006/math" xmlns:v="urn:schemas-microsoft-com:vml" xmlns:wp14="http://schemas.microsoft.com/office/word/2010/wordprocessingDrawing" xmlns:wp="http://schemas.openxmlformats.org/drawingml/2006/wordprocessingDrawing" xmlns:w10="urn:schemas-microsoft-com:office:word" xmlns:w="http://schemas.openxmlformats.org/wordprocessingml/2006/main" xmlns:w14="http://schemas.microsoft.com/office/word/2010/wordml" xmlns:w15="http://schemas.microsoft.com/office/word/2012/wordml" xmlns:w16cex="http://schemas.microsoft.com/office/word/2018/wordml/cex" xmlns:w16cid="http://schemas.microsoft.com/office/word/2016/wordml/cid" xmlns:w16="http://schemas.microsoft.com/office/word/2018/wordml" xmlns:w16du="http://schemas.microsoft.com/office/word/2023/wordml/word16du" xmlns:w16sdtdh="http://schemas.microsoft.com/office/word/2020/wordml/sdtdatahash" xmlns:w16sdtfl="http://schemas.microsoft.com/office/word/2024/wordml/sdtformatlock" xmlns:w16se="http://schemas.microsoft.com/office/word/2015/wordml/symex" xmlns:wpg="http://schemas.microsoft.com/office/word/2010/wordprocessingGroup" xmlns:wpi="http://schemas.microsoft.com/office/word/2010/wordprocessingInk" xmlns:wne="http://schemas.microsoft.com/office/word/2006/wordml" xmlns:wps="http://schemas.microsoft.com/office/word/2010/wordprocessingShape" mc:Ignorable="w14 w15 w16se w16cid w16 w16cex w16sdtdh w16sdtfl w16du wp14">
-  <w:footnote w:type="separator" w:id="-1">
+<w:footnotes xmlns:o="urn:schemas-microsoft-com:office:office" xmlns:r="http://schemas.openxmlformats.org/officeDocument/2006/relationships" xmlns:v="urn:schemas-microsoft-com:vml" xmlns:w="http://schemas.openxmlformats.org/wordprocessingml/2006/main" xmlns:w10="urn:schemas-microsoft-com:office:word" xmlns:wp="http://schemas.openxmlformats.org/drawingml/2006/wordprocessingDrawing" xmlns:pic="http://schemas.openxmlformats.org/drawingml/2006/picture" xmlns:wps="http://schemas.microsoft.com/office/word/2010/wordprocessingShape" xmlns:wpg="http://schemas.microsoft.com/office/word/2010/wordprocessingGroup" xmlns:mc="http://schemas.openxmlformats.org/markup-compatibility/2006" xmlns:wp14="http://schemas.microsoft.com/office/word/2010/wordprocessingDrawing" xmlns:w14="http://schemas.microsoft.com/office/word/2010/wordml" xmlns:w15="http://schemas.microsoft.com/office/word/2012/wordml" mc:Ignorable="w14 wp14 w15">
+  <w:footnote w:id="0" w:type="separator">
     <w:p>
       <w:r>
         <w:separator/>
       </w:r>
     </w:p>
   </w:footnote>
-  <w:footnote w:type="continuationSeparator" w:id="0">
+  <w:footnote w:id="1" w:type="continuationSeparator">
     <w:p>
       <w:r>
         <w:continuationSeparator/>
       </w:r>
     </w:p>
   </w:footnote>
-  <w:footnote w:id="1">
+  <w:footnote w:id="2">
     <w:p>
       <w:pPr>
         <w:pStyle w:val="FootnoteText"/>
+        <w:spacing w:before="0" w:after="200"/>
+        <w:rPr/>
       </w:pPr>
       <w:r>
         <w:rPr>
-          <w:rStyle w:val="FootnoteReference"/>
+          <w:rStyle w:val="FootnoteCharacters"/>
         </w:rPr>
         <w:footnoteRef/>
       </w:r>
       <w:r>
-        <w:t xml:space="preserve"> Footnote Text.</w:t>
+        <w:rPr/>
+        <w:t xml:space="preserve"> </w:t>
+      </w:r>
+      <w:r>
+        <w:rPr/>
+        <w:t>Footnote Text.</w:t>
       </w:r>
     </w:p>
   </w:footnote>
@@ -1049,22 +1189,26 @@
 </file>
 
 <file path=word/header1.xml><?xml version="1.0" encoding="utf-8"?>
-<w:hdr xmlns:wpc="http://schemas.microsoft.com/office/word/2010/wordprocessingCanvas" xmlns:cx="http://schemas.microsoft.com/office/drawing/2014/chartex" xmlns:cx1="http://schemas.microsoft.com/office/drawing/2015/9/8/chartex" xmlns:cx2="http://schemas.microsoft.com/office/drawing/2015/10/21/chartex" xmlns:cx3="http://schemas.microsoft.com/office/drawing/2016/5/9/chartex" xmlns:cx4="http://schemas.microsoft.com/office/drawing/2016/5/10/chartex" xmlns:cx5="http://schemas.microsoft.com/office/drawing/2016/5/11/chartex" xmlns:cx6="http://schemas.microsoft.com/office/drawing/2016/5/12/chartex" xmlns:cx7="http://schemas.microsoft.com/office/drawing/2016/5/13/chartex" xmlns:cx8="http://schemas.microsoft.com/office/drawing/2016/5/14/chartex" xmlns:mc="http://schemas.openxmlformats.org/markup-compatibility/2006" xmlns:aink="http://schemas.microsoft.com/office/drawing/2016/ink" xmlns:am3d="http://schemas.microsoft.com/office/drawing/2017/model3d" xmlns:o="urn:schemas-microsoft-com:office:office" xmlns:oel="http://schemas.microsoft.com/office/2019/extlst" xmlns:r="http://schemas.openxmlformats.org/officeDocument/2006/relationships" xmlns:m="http://schemas.openxmlformats.org/officeDocument/2006/math" xmlns:v="urn:schemas-microsoft-com:vml" xmlns:wp14="http://schemas.microsoft.com/office/word/2010/wordprocessingDrawing" xmlns:wp="http://schemas.openxmlformats.org/drawingml/2006/wordprocessingDrawing" xmlns:w10="urn:schemas-microsoft-com:office:word" xmlns:w="http://schemas.openxmlformats.org/wordprocessingml/2006/main" xmlns:w14="http://schemas.microsoft.com/office/word/2010/wordml" xmlns:w15="http://schemas.microsoft.com/office/word/2012/wordml" xmlns:w16cex="http://schemas.microsoft.com/office/word/2018/wordml/cex" xmlns:w16cid="http://schemas.microsoft.com/office/word/2016/wordml/cid" xmlns:w16="http://schemas.microsoft.com/office/word/2018/wordml" xmlns:w16du="http://schemas.microsoft.com/office/word/2023/wordml/word16du" xmlns:w16sdtdh="http://schemas.microsoft.com/office/word/2020/wordml/sdtdatahash" xmlns:w16sdtfl="http://schemas.microsoft.com/office/word/2024/wordml/sdtformatlock" xmlns:w16se="http://schemas.microsoft.com/office/word/2015/wordml/symex" xmlns:wpg="http://schemas.microsoft.com/office/word/2010/wordprocessingGroup" xmlns:wpi="http://schemas.microsoft.com/office/word/2010/wordprocessingInk" xmlns:wne="http://schemas.microsoft.com/office/word/2006/wordml" xmlns:wps="http://schemas.microsoft.com/office/word/2010/wordprocessingShape" mc:Ignorable="w14 w15 w16se w16cid w16 w16cex w16sdtdh w16sdtfl w16du wp14">
+<w:hdr xmlns:o="urn:schemas-microsoft-com:office:office" xmlns:r="http://schemas.openxmlformats.org/officeDocument/2006/relationships" xmlns:v="urn:schemas-microsoft-com:vml" xmlns:w="http://schemas.openxmlformats.org/wordprocessingml/2006/main" xmlns:w10="urn:schemas-microsoft-com:office:word" xmlns:wp="http://schemas.openxmlformats.org/drawingml/2006/wordprocessingDrawing" xmlns:pic="http://schemas.openxmlformats.org/drawingml/2006/picture" xmlns:wps="http://schemas.microsoft.com/office/word/2010/wordprocessingShape" xmlns:wpg="http://schemas.microsoft.com/office/word/2010/wordprocessingGroup" xmlns:mc="http://schemas.openxmlformats.org/markup-compatibility/2006" xmlns:wp14="http://schemas.microsoft.com/office/word/2010/wordprocessingDrawing" xmlns:w14="http://schemas.microsoft.com/office/word/2010/wordml" xmlns:w15="http://schemas.microsoft.com/office/word/2012/wordml" mc:Ignorable="w14 wp14 w15">
   <w:p>
     <w:pPr>
       <w:pStyle w:val="Header"/>
-    </w:pPr>
+      <w:rPr/>
+    </w:pPr>
+    <w:r>
+      <w:rPr/>
+    </w:r>
   </w:p>
 </w:hdr>
 </file>
 
 <file path=word/header2.xml><?xml version="1.0" encoding="utf-8"?>
-<w:hdr xmlns:wpc="http://schemas.microsoft.com/office/word/2010/wordprocessingCanvas" xmlns:cx="http://schemas.microsoft.com/office/drawing/2014/chartex" xmlns:cx1="http://schemas.microsoft.com/office/drawing/2015/9/8/chartex" xmlns:cx2="http://schemas.microsoft.com/office/drawing/2015/10/21/chartex" xmlns:cx3="http://schemas.microsoft.com/office/drawing/2016/5/9/chartex" xmlns:cx4="http://schemas.microsoft.com/office/drawing/2016/5/10/chartex" xmlns:cx5="http://schemas.microsoft.com/office/drawing/2016/5/11/chartex" xmlns:cx6="http://schemas.microsoft.com/office/drawing/2016/5/12/chartex" xmlns:cx7="http://schemas.microsoft.com/office/drawing/2016/5/13/chartex" xmlns:cx8="http://schemas.microsoft.com/office/drawing/2016/5/14/chartex" xmlns:mc="http://schemas.openxmlformats.org/markup-compatibility/2006" xmlns:aink="http://schemas.microsoft.com/office/drawing/2016/ink" xmlns:am3d="http://schemas.microsoft.com/office/drawing/2017/model3d" xmlns:o="urn:schemas-microsoft-com:office:office" xmlns:oel="http://schemas.microsoft.com/office/2019/extlst" xmlns:r="http://schemas.openxmlformats.org/officeDocument/2006/relationships" xmlns:m="http://schemas.openxmlformats.org/officeDocument/2006/math" xmlns:v="urn:schemas-microsoft-com:vml" xmlns:wp14="http://schemas.microsoft.com/office/word/2010/wordprocessingDrawing" xmlns:wp="http://schemas.openxmlformats.org/drawingml/2006/wordprocessingDrawing" xmlns:w10="urn:schemas-microsoft-com:office:word" xmlns:w="http://schemas.openxmlformats.org/wordprocessingml/2006/main" xmlns:w14="http://schemas.microsoft.com/office/word/2010/wordml" xmlns:w15="http://schemas.microsoft.com/office/word/2012/wordml" xmlns:w16cex="http://schemas.microsoft.com/office/word/2018/wordml/cex" xmlns:w16cid="http://schemas.microsoft.com/office/word/2016/wordml/cid" xmlns:w16="http://schemas.microsoft.com/office/word/2018/wordml" xmlns:w16du="http://schemas.microsoft.com/office/word/2023/wordml/word16du" xmlns:w16sdtdh="http://schemas.microsoft.com/office/word/2020/wordml/sdtdatahash" xmlns:w16sdtfl="http://schemas.microsoft.com/office/word/2024/wordml/sdtformatlock" xmlns:w16se="http://schemas.microsoft.com/office/word/2015/wordml/symex" xmlns:wpg="http://schemas.microsoft.com/office/word/2010/wordprocessingGroup" xmlns:wpi="http://schemas.microsoft.com/office/word/2010/wordprocessingInk" xmlns:wne="http://schemas.microsoft.com/office/word/2006/wordml" xmlns:wps="http://schemas.microsoft.com/office/word/2010/wordprocessingShape" mc:Ignorable="w14 w15 w16se w16cid w16 w16cex w16sdtdh w16sdtfl w16du wp14">
+<w:hdr xmlns:o="urn:schemas-microsoft-com:office:office" xmlns:r="http://schemas.openxmlformats.org/officeDocument/2006/relationships" xmlns:v="urn:schemas-microsoft-com:vml" xmlns:w="http://schemas.openxmlformats.org/wordprocessingml/2006/main" xmlns:w10="urn:schemas-microsoft-com:office:word" xmlns:wp="http://schemas.openxmlformats.org/drawingml/2006/wordprocessingDrawing" xmlns:pic="http://schemas.openxmlformats.org/drawingml/2006/picture" xmlns:wps="http://schemas.microsoft.com/office/word/2010/wordprocessingShape" xmlns:wpg="http://schemas.microsoft.com/office/word/2010/wordprocessingGroup" xmlns:mc="http://schemas.openxmlformats.org/markup-compatibility/2006" xmlns:wp14="http://schemas.microsoft.com/office/word/2010/wordprocessingDrawing" xmlns:w14="http://schemas.microsoft.com/office/word/2010/wordml" xmlns:w15="http://schemas.microsoft.com/office/word/2012/wordml" mc:Ignorable="w14 wp14 w15">
   <w:p>
     <w:pPr>
       <w:pStyle w:val="Header"/>
       <w:pBdr>
-        <w:bottom w:val="single" w:sz="4" w:space="1" w:color="auto"/>
+        <w:bottom w:val="single" w:sz="4" w:space="1" w:color="000000"/>
       </w:pBdr>
       <w:jc w:val="right"/>
       <w:rPr>
@@ -1073,19 +1217,13 @@
     </w:pPr>
     <w:r>
       <w:rPr>
-        <w:noProof/>
         <w:lang w:val="en-AU"/>
       </w:rPr>
       <w:t xml:space="preserve">Project number: </w:t>
     </w:r>
     <w:sdt>
       <w:sdtPr>
-        <w:rPr>
-          <w:noProof/>
-          <w:lang w:val="en-AU"/>
-        </w:rPr>
         <w:alias w:val="Category"/>
-        <w:tag w:val=""/>
         <w:id w:val="696581513"/>
         <w:placeholder>
           <w:docPart w:val="1B426B5209F04D0FB56FC07F6996AE32"/>
@@ -1095,6 +1233,11 @@
         <w:text/>
       </w:sdtPr>
       <w:sdtContent>
+        <w:r>
+          <w:rPr>
+            <w:lang w:val="en-AU"/>
+          </w:rPr>
+        </w:r>
         <w:r>
           <w:rPr>
             <w:rStyle w:val="PlaceholderText"/>
@@ -1108,27 +1251,25 @@
 </file>
 
 <file path=word/header3.xml><?xml version="1.0" encoding="utf-8"?>
-<w:hdr xmlns:wpc="http://schemas.microsoft.com/office/word/2010/wordprocessingCanvas" xmlns:cx="http://schemas.microsoft.com/office/drawing/2014/chartex" xmlns:cx1="http://schemas.microsoft.com/office/drawing/2015/9/8/chartex" xmlns:cx2="http://schemas.microsoft.com/office/drawing/2015/10/21/chartex" xmlns:cx3="http://schemas.microsoft.com/office/drawing/2016/5/9/chartex" xmlns:cx4="http://schemas.microsoft.com/office/drawing/2016/5/10/chartex" xmlns:cx5="http://schemas.microsoft.com/office/drawing/2016/5/11/chartex" xmlns:cx6="http://schemas.microsoft.com/office/drawing/2016/5/12/chartex" xmlns:cx7="http://schemas.microsoft.com/office/drawing/2016/5/13/chartex" xmlns:cx8="http://schemas.microsoft.com/office/drawing/2016/5/14/chartex" xmlns:mc="http://schemas.openxmlformats.org/markup-compatibility/2006" xmlns:aink="http://schemas.microsoft.com/office/drawing/2016/ink" xmlns:am3d="http://schemas.microsoft.com/office/drawing/2017/model3d" xmlns:o="urn:schemas-microsoft-com:office:office" xmlns:oel="http://schemas.microsoft.com/office/2019/extlst" xmlns:r="http://schemas.openxmlformats.org/officeDocument/2006/relationships" xmlns:m="http://schemas.openxmlformats.org/officeDocument/2006/math" xmlns:v="urn:schemas-microsoft-com:vml" xmlns:wp14="http://schemas.microsoft.com/office/word/2010/wordprocessingDrawing" xmlns:wp="http://schemas.openxmlformats.org/drawingml/2006/wordprocessingDrawing" xmlns:w10="urn:schemas-microsoft-com:office:word" xmlns:w="http://schemas.openxmlformats.org/wordprocessingml/2006/main" xmlns:w14="http://schemas.microsoft.com/office/word/2010/wordml" xmlns:w15="http://schemas.microsoft.com/office/word/2012/wordml" xmlns:w16cex="http://schemas.microsoft.com/office/word/2018/wordml/cex" xmlns:w16cid="http://schemas.microsoft.com/office/word/2016/wordml/cid" xmlns:w16="http://schemas.microsoft.com/office/word/2018/wordml" xmlns:w16du="http://schemas.microsoft.com/office/word/2023/wordml/word16du" xmlns:w16sdtdh="http://schemas.microsoft.com/office/word/2020/wordml/sdtdatahash" xmlns:w16sdtfl="http://schemas.microsoft.com/office/word/2024/wordml/sdtformatlock" xmlns:w16se="http://schemas.microsoft.com/office/word/2015/wordml/symex" xmlns:wpg="http://schemas.microsoft.com/office/word/2010/wordprocessingGroup" xmlns:wpi="http://schemas.microsoft.com/office/word/2010/wordprocessingInk" xmlns:wne="http://schemas.microsoft.com/office/word/2006/wordml" xmlns:wps="http://schemas.microsoft.com/office/word/2010/wordprocessingShape" mc:Ignorable="w14 w15 w16se w16cid w16 w16cex w16sdtdh w16sdtfl w16du wp14">
+<w:hdr xmlns:o="urn:schemas-microsoft-com:office:office" xmlns:r="http://schemas.openxmlformats.org/officeDocument/2006/relationships" xmlns:v="urn:schemas-microsoft-com:vml" xmlns:w="http://schemas.openxmlformats.org/wordprocessingml/2006/main" xmlns:w10="urn:schemas-microsoft-com:office:word" xmlns:wp="http://schemas.openxmlformats.org/drawingml/2006/wordprocessingDrawing" xmlns:pic="http://schemas.openxmlformats.org/drawingml/2006/picture" xmlns:wps="http://schemas.microsoft.com/office/word/2010/wordprocessingShape" xmlns:wpg="http://schemas.microsoft.com/office/word/2010/wordprocessingGroup" xmlns:mc="http://schemas.openxmlformats.org/markup-compatibility/2006" xmlns:wp14="http://schemas.microsoft.com/office/word/2010/wordprocessingDrawing" xmlns:w14="http://schemas.microsoft.com/office/word/2010/wordml" xmlns:w15="http://schemas.microsoft.com/office/word/2012/wordml" mc:Ignorable="w14 wp14 w15">
   <w:p>
     <w:pPr>
       <w:pStyle w:val="Header"/>
       <w:jc w:val="right"/>
+      <w:rPr/>
     </w:pPr>
     <w:r>
-      <w:ptab w:relativeTo="margin" w:alignment="center" w:leader="none"/>
+      <w:rPr/>
+      <w:tab/>
+      <w:tab/>
     </w:r>
     <w:r>
-      <w:ptab w:relativeTo="margin" w:alignment="right" w:leader="none"/>
-    </w:r>
-    <w:r>
-      <w:rPr>
-        <w:noProof/>
-      </w:rPr>
+      <w:rPr/>
       <w:drawing>
-        <wp:inline distT="0" distB="0" distL="0" distR="0" wp14:anchorId="14F6FBE5" wp14:editId="22766F10">
-          <wp:extent cx="1800000" cy="818941"/>
+        <wp:inline distT="0" distB="0" distL="0" distR="0">
+          <wp:extent cx="1800225" cy="819150"/>
           <wp:effectExtent l="0" t="0" r="0" b="0"/>
-          <wp:docPr id="1701727866" name="Graphic 1"/>
+          <wp:docPr id="1" name="Graphic 1"/>
           <wp:cNvGraphicFramePr>
             <a:graphicFrameLocks xmlns:a="http://schemas.openxmlformats.org/drawingml/2006/main" noChangeAspect="1"/>
           </wp:cNvGraphicFramePr>
@@ -1136,8 +1277,10 @@
             <a:graphicData uri="http://schemas.openxmlformats.org/drawingml/2006/picture">
               <pic:pic xmlns:pic="http://schemas.openxmlformats.org/drawingml/2006/picture">
                 <pic:nvPicPr>
-                  <pic:cNvPr id="1173876817" name="Graphic 1173876817"/>
-                  <pic:cNvPicPr/>
+                  <pic:cNvPr id="1" name="Graphic 1"/>
+                  <pic:cNvPicPr>
+                    <a:picLocks noChangeAspect="1" noChangeArrowheads="1"/>
+                  </pic:cNvPicPr>
                 </pic:nvPicPr>
                 <pic:blipFill>
                   <a:blip r:embed="rId1">
@@ -1151,14 +1294,15 @@
                     <a:fillRect/>
                   </a:stretch>
                 </pic:blipFill>
-                <pic:spPr>
+                <pic:spPr bwMode="auto">
                   <a:xfrm>
                     <a:off x="0" y="0"/>
-                    <a:ext cx="1800000" cy="818941"/>
+                    <a:ext cx="1800225" cy="819150"/>
                   </a:xfrm>
                   <a:prstGeom prst="rect">
                     <a:avLst/>
                   </a:prstGeom>
+                  <a:noFill/>
                 </pic:spPr>
               </pic:pic>
             </a:graphicData>
@@ -1170,305 +1314,66 @@
 </w:hdr>
 </file>
 
-<file path=word/numbering.xml><?xml version="1.0" encoding="utf-8"?>
-<w:numbering xmlns:wpc="http://schemas.microsoft.com/office/word/2010/wordprocessingCanvas" xmlns:cx="http://schemas.microsoft.com/office/drawing/2014/chartex" xmlns:cx1="http://schemas.microsoft.com/office/drawing/2015/9/8/chartex" xmlns:cx2="http://schemas.microsoft.com/office/drawing/2015/10/21/chartex" xmlns:cx3="http://schemas.microsoft.com/office/drawing/2016/5/9/chartex" xmlns:cx4="http://schemas.microsoft.com/office/drawing/2016/5/10/chartex" xmlns:cx5="http://schemas.microsoft.com/office/drawing/2016/5/11/chartex" xmlns:cx6="http://schemas.microsoft.com/office/drawing/2016/5/12/chartex" xmlns:cx7="http://schemas.microsoft.com/office/drawing/2016/5/13/chartex" xmlns:cx8="http://schemas.microsoft.com/office/drawing/2016/5/14/chartex" xmlns:mc="http://schemas.openxmlformats.org/markup-compatibility/2006" xmlns:aink="http://schemas.microsoft.com/office/drawing/2016/ink" xmlns:am3d="http://schemas.microsoft.com/office/drawing/2017/model3d" xmlns:o="urn:schemas-microsoft-com:office:office" xmlns:oel="http://schemas.microsoft.com/office/2019/extlst" xmlns:r="http://schemas.openxmlformats.org/officeDocument/2006/relationships" xmlns:m="http://schemas.openxmlformats.org/officeDocument/2006/math" xmlns:v="urn:schemas-microsoft-com:vml" xmlns:wp14="http://schemas.microsoft.com/office/word/2010/wordprocessingDrawing" xmlns:wp="http://schemas.openxmlformats.org/drawingml/2006/wordprocessingDrawing" xmlns:w10="urn:schemas-microsoft-com:office:word" xmlns:w="http://schemas.openxmlformats.org/wordprocessingml/2006/main" xmlns:w14="http://schemas.microsoft.com/office/word/2010/wordml" xmlns:w15="http://schemas.microsoft.com/office/word/2012/wordml" xmlns:w16cex="http://schemas.microsoft.com/office/word/2018/wordml/cex" xmlns:w16cid="http://schemas.microsoft.com/office/word/2016/wordml/cid" xmlns:w16="http://schemas.microsoft.com/office/word/2018/wordml" xmlns:w16du="http://schemas.microsoft.com/office/word/2023/wordml/word16du" xmlns:w16sdtdh="http://schemas.microsoft.com/office/word/2020/wordml/sdtdatahash" xmlns:w16sdtfl="http://schemas.microsoft.com/office/word/2024/wordml/sdtformatlock" xmlns:w16se="http://schemas.microsoft.com/office/word/2015/wordml/symex" xmlns:wpg="http://schemas.microsoft.com/office/word/2010/wordprocessingGroup" xmlns:wpi="http://schemas.microsoft.com/office/word/2010/wordprocessingInk" xmlns:wne="http://schemas.microsoft.com/office/word/2006/wordml" xmlns:wps="http://schemas.microsoft.com/office/word/2010/wordprocessingShape" mc:Ignorable="w14 w15 w16se w16cid w16 w16cex w16sdtdh w16sdtfl w16du wp14">
-  <w:abstractNum w:abstractNumId="0" w15:restartNumberingAfterBreak="0">
-    <w:nsid w:val="170CD2DE"/>
-    <w:multiLevelType w:val="multilevel"/>
-    <w:tmpl w:val="95D0F09C"/>
-    <w:lvl w:ilvl="0">
-      <w:numFmt w:val="bullet"/>
-      <w:lvlText w:val=" "/>
-      <w:lvlJc w:val="left"/>
-      <w:pPr>
-        <w:tabs>
-          <w:tab w:val="num" w:pos="0"/>
-        </w:tabs>
-        <w:ind w:left="480" w:hanging="480"/>
-      </w:pPr>
-    </w:lvl>
-    <w:lvl w:ilvl="1">
-      <w:numFmt w:val="bullet"/>
-      <w:lvlText w:val=" "/>
-      <w:lvlJc w:val="left"/>
-      <w:pPr>
-        <w:tabs>
-          <w:tab w:val="num" w:pos="720"/>
-        </w:tabs>
-        <w:ind w:left="1200" w:hanging="480"/>
-      </w:pPr>
-    </w:lvl>
-    <w:lvl w:ilvl="2">
-      <w:numFmt w:val="bullet"/>
-      <w:lvlText w:val=" "/>
-      <w:lvlJc w:val="left"/>
-      <w:pPr>
-        <w:tabs>
-          <w:tab w:val="num" w:pos="1440"/>
-        </w:tabs>
-        <w:ind w:left="1920" w:hanging="480"/>
-      </w:pPr>
-    </w:lvl>
-    <w:lvl w:ilvl="3">
-      <w:numFmt w:val="bullet"/>
-      <w:lvlText w:val=" "/>
-      <w:lvlJc w:val="left"/>
-      <w:pPr>
-        <w:tabs>
-          <w:tab w:val="num" w:pos="2160"/>
-        </w:tabs>
-        <w:ind w:left="2640" w:hanging="480"/>
-      </w:pPr>
-    </w:lvl>
-    <w:lvl w:ilvl="4">
-      <w:numFmt w:val="bullet"/>
-      <w:lvlText w:val=" "/>
-      <w:lvlJc w:val="left"/>
-      <w:pPr>
-        <w:tabs>
-          <w:tab w:val="num" w:pos="2880"/>
-        </w:tabs>
-        <w:ind w:left="3360" w:hanging="480"/>
-      </w:pPr>
-    </w:lvl>
-    <w:lvl w:ilvl="5">
-      <w:numFmt w:val="bullet"/>
-      <w:lvlText w:val=" "/>
-      <w:lvlJc w:val="left"/>
-      <w:pPr>
-        <w:tabs>
-          <w:tab w:val="num" w:pos="3600"/>
-        </w:tabs>
-        <w:ind w:left="4080" w:hanging="480"/>
-      </w:pPr>
-    </w:lvl>
-    <w:lvl w:ilvl="6">
-      <w:numFmt w:val="bullet"/>
-      <w:lvlText w:val=" "/>
-      <w:lvlJc w:val="left"/>
-      <w:pPr>
-        <w:tabs>
-          <w:tab w:val="num" w:pos="4320"/>
-        </w:tabs>
-        <w:ind w:left="4800" w:hanging="480"/>
-      </w:pPr>
-    </w:lvl>
-    <w:lvl w:ilvl="7">
-      <w:numFmt w:val="bullet"/>
-      <w:lvlText w:val=" "/>
-      <w:lvlJc w:val="left"/>
-      <w:pPr>
-        <w:tabs>
-          <w:tab w:val="num" w:pos="5040"/>
-        </w:tabs>
-        <w:ind w:left="5520" w:hanging="480"/>
-      </w:pPr>
-    </w:lvl>
-    <w:lvl w:ilvl="8">
-      <w:numFmt w:val="bullet"/>
-      <w:lvlText w:val=" "/>
-      <w:lvlJc w:val="left"/>
-      <w:pPr>
-        <w:tabs>
-          <w:tab w:val="num" w:pos="5760"/>
-        </w:tabs>
-        <w:ind w:left="6240" w:hanging="480"/>
-      </w:pPr>
-    </w:lvl>
-  </w:abstractNum>
-  <w:abstractNum w:abstractNumId="1" w15:restartNumberingAfterBreak="0">
-    <w:nsid w:val="1C603469"/>
-    <w:multiLevelType w:val="hybridMultilevel"/>
-    <w:tmpl w:val="DBFCF5A2"/>
-    <w:lvl w:ilvl="0" w:tplc="EFD8B76A">
-      <w:start w:val="1"/>
-      <w:numFmt w:val="lowerLetter"/>
-      <w:lvlText w:val="%1."/>
-      <w:lvlJc w:val="left"/>
-      <w:pPr>
-        <w:ind w:left="720" w:hanging="360"/>
-      </w:pPr>
+<file path=word/header4.xml><?xml version="1.0" encoding="utf-8"?>
+<w:hdr xmlns:o="urn:schemas-microsoft-com:office:office" xmlns:r="http://schemas.openxmlformats.org/officeDocument/2006/relationships" xmlns:v="urn:schemas-microsoft-com:vml" xmlns:w="http://schemas.openxmlformats.org/wordprocessingml/2006/main" xmlns:w10="urn:schemas-microsoft-com:office:word" xmlns:wp="http://schemas.openxmlformats.org/drawingml/2006/wordprocessingDrawing" xmlns:pic="http://schemas.openxmlformats.org/drawingml/2006/picture" xmlns:wps="http://schemas.microsoft.com/office/word/2010/wordprocessingShape" xmlns:wpg="http://schemas.microsoft.com/office/word/2010/wordprocessingGroup" xmlns:mc="http://schemas.openxmlformats.org/markup-compatibility/2006" xmlns:wp14="http://schemas.microsoft.com/office/word/2010/wordprocessingDrawing" xmlns:w14="http://schemas.microsoft.com/office/word/2010/wordml" xmlns:w15="http://schemas.microsoft.com/office/word/2012/wordml" mc:Ignorable="w14 wp14 w15">
+  <w:p>
+    <w:pPr>
+      <w:pStyle w:val="Header"/>
+      <w:pBdr>
+        <w:bottom w:val="single" w:sz="4" w:space="1" w:color="000000"/>
+      </w:pBdr>
+      <w:jc w:val="right"/>
       <w:rPr>
-        <w:rFonts w:ascii="Arial" w:hAnsi="Arial" w:hint="default"/>
+        <w:lang w:val="en-AU"/>
       </w:rPr>
-    </w:lvl>
-    <w:lvl w:ilvl="1" w:tplc="0C090019" w:tentative="1">
-      <w:start w:val="1"/>
-      <w:numFmt w:val="lowerLetter"/>
-      <w:lvlText w:val="%2."/>
-      <w:lvlJc w:val="left"/>
-      <w:pPr>
-        <w:ind w:left="1440" w:hanging="360"/>
-      </w:pPr>
-    </w:lvl>
-    <w:lvl w:ilvl="2" w:tplc="0C09001B" w:tentative="1">
-      <w:start w:val="1"/>
-      <w:numFmt w:val="lowerRoman"/>
-      <w:lvlText w:val="%3."/>
-      <w:lvlJc w:val="right"/>
-      <w:pPr>
-        <w:ind w:left="2160" w:hanging="180"/>
-      </w:pPr>
-    </w:lvl>
-    <w:lvl w:ilvl="3" w:tplc="0C09000F" w:tentative="1">
-      <w:start w:val="1"/>
-      <w:numFmt w:val="decimal"/>
-      <w:lvlText w:val="%4."/>
-      <w:lvlJc w:val="left"/>
-      <w:pPr>
-        <w:ind w:left="2880" w:hanging="360"/>
-      </w:pPr>
-    </w:lvl>
-    <w:lvl w:ilvl="4" w:tplc="0C090019" w:tentative="1">
-      <w:start w:val="1"/>
-      <w:numFmt w:val="lowerLetter"/>
-      <w:lvlText w:val="%5."/>
-      <w:lvlJc w:val="left"/>
-      <w:pPr>
-        <w:ind w:left="3600" w:hanging="360"/>
-      </w:pPr>
-    </w:lvl>
-    <w:lvl w:ilvl="5" w:tplc="0C09001B" w:tentative="1">
-      <w:start w:val="1"/>
-      <w:numFmt w:val="lowerRoman"/>
-      <w:lvlText w:val="%6."/>
-      <w:lvlJc w:val="right"/>
-      <w:pPr>
-        <w:ind w:left="4320" w:hanging="180"/>
-      </w:pPr>
-    </w:lvl>
-    <w:lvl w:ilvl="6" w:tplc="0C09000F" w:tentative="1">
-      <w:start w:val="1"/>
-      <w:numFmt w:val="decimal"/>
-      <w:lvlText w:val="%7."/>
-      <w:lvlJc w:val="left"/>
-      <w:pPr>
-        <w:ind w:left="5040" w:hanging="360"/>
-      </w:pPr>
-    </w:lvl>
-    <w:lvl w:ilvl="7" w:tplc="0C090019" w:tentative="1">
-      <w:start w:val="1"/>
-      <w:numFmt w:val="lowerLetter"/>
-      <w:lvlText w:val="%8."/>
-      <w:lvlJc w:val="left"/>
-      <w:pPr>
-        <w:ind w:left="5760" w:hanging="360"/>
-      </w:pPr>
-    </w:lvl>
-    <w:lvl w:ilvl="8" w:tplc="0C09001B" w:tentative="1">
-      <w:start w:val="1"/>
-      <w:numFmt w:val="lowerRoman"/>
-      <w:lvlText w:val="%9."/>
-      <w:lvlJc w:val="right"/>
-      <w:pPr>
-        <w:ind w:left="6480" w:hanging="180"/>
-      </w:pPr>
-    </w:lvl>
-  </w:abstractNum>
-  <w:abstractNum w:abstractNumId="2" w15:restartNumberingAfterBreak="0">
-    <w:nsid w:val="76BE21DF"/>
-    <w:multiLevelType w:val="hybridMultilevel"/>
-    <w:tmpl w:val="4DB0B372"/>
-    <w:lvl w:ilvl="0" w:tplc="F836F038">
-      <w:start w:val="1"/>
-      <w:numFmt w:val="decimal"/>
-      <w:lvlText w:val="%1."/>
-      <w:lvlJc w:val="left"/>
-      <w:pPr>
-        <w:ind w:left="720" w:hanging="360"/>
-      </w:pPr>
-    </w:lvl>
-    <w:lvl w:ilvl="1" w:tplc="0C090019" w:tentative="1">
-      <w:start w:val="1"/>
-      <w:numFmt w:val="lowerLetter"/>
-      <w:lvlText w:val="%2."/>
-      <w:lvlJc w:val="left"/>
-      <w:pPr>
-        <w:ind w:left="1440" w:hanging="360"/>
-      </w:pPr>
-    </w:lvl>
-    <w:lvl w:ilvl="2" w:tplc="0C09001B" w:tentative="1">
-      <w:start w:val="1"/>
-      <w:numFmt w:val="lowerRoman"/>
-      <w:lvlText w:val="%3."/>
-      <w:lvlJc w:val="right"/>
-      <w:pPr>
-        <w:ind w:left="2160" w:hanging="180"/>
-      </w:pPr>
-    </w:lvl>
-    <w:lvl w:ilvl="3" w:tplc="0C09000F" w:tentative="1">
-      <w:start w:val="1"/>
-      <w:numFmt w:val="decimal"/>
-      <w:lvlText w:val="%4."/>
-      <w:lvlJc w:val="left"/>
-      <w:pPr>
-        <w:ind w:left="2880" w:hanging="360"/>
-      </w:pPr>
-    </w:lvl>
-    <w:lvl w:ilvl="4" w:tplc="0C090019" w:tentative="1">
-      <w:start w:val="1"/>
-      <w:numFmt w:val="lowerLetter"/>
-      <w:lvlText w:val="%5."/>
-      <w:lvlJc w:val="left"/>
-      <w:pPr>
-        <w:ind w:left="3600" w:hanging="360"/>
-      </w:pPr>
-    </w:lvl>
-    <w:lvl w:ilvl="5" w:tplc="0C09001B" w:tentative="1">
-      <w:start w:val="1"/>
-      <w:numFmt w:val="lowerRoman"/>
-      <w:lvlText w:val="%6."/>
-      <w:lvlJc w:val="right"/>
-      <w:pPr>
-        <w:ind w:left="4320" w:hanging="180"/>
-      </w:pPr>
-    </w:lvl>
-    <w:lvl w:ilvl="6" w:tplc="0C09000F" w:tentative="1">
-      <w:start w:val="1"/>
-      <w:numFmt w:val="decimal"/>
-      <w:lvlText w:val="%7."/>
-      <w:lvlJc w:val="left"/>
-      <w:pPr>
-        <w:ind w:left="5040" w:hanging="360"/>
-      </w:pPr>
-    </w:lvl>
-    <w:lvl w:ilvl="7" w:tplc="0C090019" w:tentative="1">
-      <w:start w:val="1"/>
-      <w:numFmt w:val="lowerLetter"/>
-      <w:lvlText w:val="%8."/>
-      <w:lvlJc w:val="left"/>
-      <w:pPr>
-        <w:ind w:left="5760" w:hanging="360"/>
-      </w:pPr>
-    </w:lvl>
-    <w:lvl w:ilvl="8" w:tplc="0C09001B" w:tentative="1">
-      <w:start w:val="1"/>
-      <w:numFmt w:val="lowerRoman"/>
-      <w:lvlText w:val="%9."/>
-      <w:lvlJc w:val="right"/>
-      <w:pPr>
-        <w:ind w:left="6480" w:hanging="180"/>
-      </w:pPr>
-    </w:lvl>
-  </w:abstractNum>
-  <w:num w:numId="1" w16cid:durableId="279580174">
-    <w:abstractNumId w:val="0"/>
-  </w:num>
-  <w:num w:numId="2" w16cid:durableId="136266283">
-    <w:abstractNumId w:val="1"/>
-  </w:num>
-  <w:num w:numId="3" w16cid:durableId="692073321">
-    <w:abstractNumId w:val="2"/>
-  </w:num>
-</w:numbering>
+    </w:pPr>
+    <w:r>
+      <w:rPr>
+        <w:lang w:val="en-AU"/>
+      </w:rPr>
+      <w:t xml:space="preserve">Project number: </w:t>
+    </w:r>
+    <w:sdt>
+      <w:sdtPr>
+        <w:alias w:val="Category"/>
+        <w:id w:val="696581513"/>
+        <w:placeholder>
+          <w:docPart w:val="1B426B5209F04D0FB56FC07F6996AE32"/>
+        </w:placeholder>
+        <w:showingPlcHdr/>
+        <w:dataBinding w:prefixMappings="xmlns:ns0='http://purl.org/dc/elements/1.1/' xmlns:ns1='http://schemas.openxmlformats.org/package/2006/metadata/core-properties' " w:xpath="/ns1:coreProperties[1]/ns1:category[1]" w:storeItemID="{6C3C8BC8-F283-45AE-878A-BAB7291924A1}"/>
+        <w:text/>
+      </w:sdtPr>
+      <w:sdtContent>
+        <w:r>
+          <w:rPr>
+            <w:lang w:val="en-AU"/>
+          </w:rPr>
+        </w:r>
+        <w:r>
+          <w:rPr>
+            <w:rStyle w:val="PlaceholderText"/>
+          </w:rPr>
+          <w:t>[Category]</w:t>
+        </w:r>
+      </w:sdtContent>
+    </w:sdt>
+  </w:p>
+</w:hdr>
+</file>
+
+<file path=word/header5.xml><?xml version="1.0" encoding="utf-8"?>
+<w:hdr xmlns:o="urn:schemas-microsoft-com:office:office" xmlns:r="http://schemas.openxmlformats.org/officeDocument/2006/relationships" xmlns:v="urn:schemas-microsoft-com:vml" xmlns:w="http://schemas.openxmlformats.org/wordprocessingml/2006/main" xmlns:w10="urn:schemas-microsoft-com:office:word" xmlns:wp="http://schemas.openxmlformats.org/drawingml/2006/wordprocessingDrawing" xmlns:pic="http://schemas.openxmlformats.org/drawingml/2006/picture" xmlns:wps="http://schemas.microsoft.com/office/word/2010/wordprocessingShape" xmlns:wpg="http://schemas.microsoft.com/office/word/2010/wordprocessingGroup" xmlns:mc="http://schemas.openxmlformats.org/markup-compatibility/2006" xmlns:wp14="http://schemas.microsoft.com/office/word/2010/wordprocessingDrawing" xmlns:w14="http://schemas.microsoft.com/office/word/2010/wordml" xmlns:w15="http://schemas.microsoft.com/office/word/2012/wordml" mc:Ignorable="w14 wp14 w15">
+  <w:p/>
+</w:hdr>
 </file>
 
 <file path=word/styles.xml><?xml version="1.0" encoding="utf-8"?>
-<w:styles xmlns:mc="http://schemas.openxmlformats.org/markup-compatibility/2006" xmlns:r="http://schemas.openxmlformats.org/officeDocument/2006/relationships" xmlns:w="http://schemas.openxmlformats.org/wordprocessingml/2006/main" xmlns:w14="http://schemas.microsoft.com/office/word/2010/wordml" xmlns:w15="http://schemas.microsoft.com/office/word/2012/wordml" xmlns:w16cex="http://schemas.microsoft.com/office/word/2018/wordml/cex" xmlns:w16cid="http://schemas.microsoft.com/office/word/2016/wordml/cid" xmlns:w16="http://schemas.microsoft.com/office/word/2018/wordml" xmlns:w16du="http://schemas.microsoft.com/office/word/2023/wordml/word16du" xmlns:w16sdtdh="http://schemas.microsoft.com/office/word/2020/wordml/sdtdatahash" xmlns:w16sdtfl="http://schemas.microsoft.com/office/word/2024/wordml/sdtformatlock" xmlns:w16se="http://schemas.microsoft.com/office/word/2015/wordml/symex" mc:Ignorable="w14 w15 w16se w16cid w16 w16cex w16sdtdh w16sdtfl w16du">
+<w:styles xmlns:w="http://schemas.openxmlformats.org/wordprocessingml/2006/main" xmlns:w14="http://schemas.microsoft.com/office/word/2010/wordml" xmlns:mc="http://schemas.openxmlformats.org/markup-compatibility/2006" mc:Ignorable="w14">
   <w:docDefaults>
     <w:rPrDefault>
       <w:rPr>
-        <w:rFonts w:asciiTheme="minorHAnsi" w:eastAsiaTheme="minorHAnsi" w:hAnsiTheme="minorHAnsi" w:cstheme="minorBidi"/>
+        <w:rFonts w:ascii="Cambria" w:hAnsi="Cambria" w:eastAsia="Cambria" w:cs="" w:asciiTheme="minorHAnsi" w:cstheme="minorBidi" w:eastAsiaTheme="minorHAnsi" w:hAnsiTheme="minorHAnsi"/>
         <w:sz w:val="24"/>
         <w:szCs w:val="24"/>
         <w:lang w:val="en-US" w:eastAsia="en-US" w:bidi="ar-SA"/>
@@ -1476,7 +1381,7 @@
     </w:rPrDefault>
     <w:pPrDefault>
       <w:pPr>
-        <w:spacing w:after="200"/>
+        <w:suppressAutoHyphens w:val="true"/>
       </w:pPr>
     </w:pPrDefault>
   </w:docDefaults>
@@ -1724,20 +1629,29 @@
     <w:lsdException w:name="List Table 5 Dark Accent 6" w:uiPriority="50"/>
     <w:lsdException w:name="List Table 6 Colorful Accent 6" w:uiPriority="51"/>
     <w:lsdException w:name="List Table 7 Colorful Accent 6" w:uiPriority="52"/>
-    <w:lsdException w:name="Mention" w:semiHidden="1" w:uiPriority="99" w:unhideWhenUsed="1"/>
-    <w:lsdException w:name="Smart Hyperlink" w:semiHidden="1" w:uiPriority="99" w:unhideWhenUsed="1"/>
-    <w:lsdException w:name="Hashtag" w:semiHidden="1" w:uiPriority="99" w:unhideWhenUsed="1"/>
-    <w:lsdException w:name="Unresolved Mention" w:semiHidden="1" w:uiPriority="99" w:unhideWhenUsed="1"/>
-    <w:lsdException w:name="Smart Link" w:semiHidden="1" w:uiPriority="99" w:unhideWhenUsed="1"/>
+    <w:lsdException w:name="Mention" w:uiPriority="99" w:semiHidden="1" w:unhideWhenUsed="1"/>
+    <w:lsdException w:name="Smart Hyperlink" w:uiPriority="99" w:semiHidden="1" w:unhideWhenUsed="1"/>
+    <w:lsdException w:name="Hashtag" w:uiPriority="99" w:semiHidden="1" w:unhideWhenUsed="1"/>
+    <w:lsdException w:name="Unresolved Mention" w:uiPriority="99" w:semiHidden="1" w:unhideWhenUsed="1"/>
+    <w:lsdException w:name="Smart Link" w:uiPriority="99" w:semiHidden="1" w:unhideWhenUsed="1"/>
   </w:latentStyles>
-  <w:style w:type="paragraph" w:default="1" w:styleId="Normal">
+  <w:style w:type="paragraph" w:styleId="Normal" w:default="1">
     <w:name w:val="Normal"/>
     <w:qFormat/>
-    <w:rsid w:val="00706FD1"/>
+    <w:rsid w:val="00706fd1"/>
+    <w:pPr>
+      <w:widowControl/>
+      <w:bidi w:val="0"/>
+      <w:spacing w:before="0" w:after="200"/>
+      <w:jc w:val="left"/>
+    </w:pPr>
     <w:rPr>
-      <w:rFonts w:ascii="Proxima Nova Rg" w:eastAsiaTheme="minorEastAsia" w:hAnsi="Proxima Nova Rg" w:cs="Times New Roman (Body CS)"/>
-      <w:kern w:val="21"/>
+      <w:rFonts w:ascii="Proxima Nova Rg" w:hAnsi="Proxima Nova Rg" w:eastAsia="" w:cs="Times New Roman (Body CS)" w:eastAsiaTheme="minorEastAsia"/>
+      <w:color w:val="auto"/>
+      <w:kern w:val="2"/>
       <w:sz w:val="22"/>
+      <w:szCs w:val="24"/>
+      <w:lang w:val="en-US" w:eastAsia="en-US" w:bidi="ar-SA"/>
     </w:rPr>
   </w:style>
   <w:style w:type="paragraph" w:styleId="Heading1">
@@ -1746,15 +1660,15 @@
     <w:next w:val="BodyText"/>
     <w:uiPriority w:val="9"/>
     <w:qFormat/>
-    <w:rsid w:val="00E61719"/>
-    <w:pPr>
-      <w:keepNext/>
+    <w:rsid w:val="00e61719"/>
+    <w:pPr>
+      <w:keepNext w:val="true"/>
       <w:keepLines/>
       <w:spacing w:before="480" w:after="0"/>
       <w:outlineLvl w:val="0"/>
     </w:pPr>
     <w:rPr>
-      <w:rFonts w:eastAsiaTheme="majorEastAsia" w:cstheme="majorBidi"/>
+      <w:rFonts w:eastAsia="" w:cs="" w:cstheme="majorBidi" w:eastAsiaTheme="majorEastAsia"/>
       <w:b/>
       <w:bCs/>
       <w:sz w:val="40"/>
@@ -1768,15 +1682,15 @@
     <w:uiPriority w:val="9"/>
     <w:unhideWhenUsed/>
     <w:qFormat/>
-    <w:rsid w:val="00E0014C"/>
-    <w:pPr>
-      <w:keepNext/>
+    <w:rsid w:val="00e0014c"/>
+    <w:pPr>
+      <w:keepNext w:val="true"/>
       <w:keepLines/>
       <w:spacing w:before="200" w:after="0"/>
       <w:outlineLvl w:val="1"/>
     </w:pPr>
     <w:rPr>
-      <w:rFonts w:eastAsiaTheme="majorEastAsia" w:cs="Times New Roman (Headings CS)"/>
+      <w:rFonts w:eastAsia="" w:cs="Times New Roman (Headings CS)" w:eastAsiaTheme="majorEastAsia"/>
       <w:b/>
       <w:bCs/>
       <w:color w:val="262625"/>
@@ -1791,15 +1705,15 @@
     <w:uiPriority w:val="9"/>
     <w:unhideWhenUsed/>
     <w:qFormat/>
-    <w:rsid w:val="00E61719"/>
-    <w:pPr>
-      <w:keepNext/>
+    <w:rsid w:val="00e61719"/>
+    <w:pPr>
+      <w:keepNext w:val="true"/>
       <w:keepLines/>
       <w:spacing w:before="200" w:after="0"/>
       <w:outlineLvl w:val="2"/>
     </w:pPr>
     <w:rPr>
-      <w:rFonts w:eastAsiaTheme="majorEastAsia" w:cstheme="majorBidi"/>
+      <w:rFonts w:eastAsia="" w:cs="" w:cstheme="majorBidi" w:eastAsiaTheme="majorEastAsia"/>
       <w:b/>
       <w:bCs/>
     </w:rPr>
@@ -1811,15 +1725,15 @@
     <w:uiPriority w:val="9"/>
     <w:unhideWhenUsed/>
     <w:qFormat/>
-    <w:rsid w:val="00E0014C"/>
-    <w:pPr>
-      <w:keepNext/>
+    <w:rsid w:val="00e0014c"/>
+    <w:pPr>
+      <w:keepNext w:val="true"/>
       <w:keepLines/>
       <w:spacing w:before="200" w:after="0"/>
       <w:outlineLvl w:val="3"/>
     </w:pPr>
     <w:rPr>
-      <w:rFonts w:eastAsiaTheme="majorEastAsia" w:cstheme="majorBidi"/>
+      <w:rFonts w:eastAsia="" w:cs="" w:cstheme="majorBidi" w:eastAsiaTheme="majorEastAsia"/>
       <w:bCs/>
       <w:i/>
     </w:rPr>
@@ -1831,15 +1745,15 @@
     <w:uiPriority w:val="9"/>
     <w:unhideWhenUsed/>
     <w:qFormat/>
-    <w:rsid w:val="00E0014C"/>
-    <w:pPr>
-      <w:keepNext/>
+    <w:rsid w:val="00e0014c"/>
+    <w:pPr>
+      <w:keepNext w:val="true"/>
       <w:keepLines/>
       <w:spacing w:before="200" w:after="0"/>
       <w:outlineLvl w:val="4"/>
     </w:pPr>
     <w:rPr>
-      <w:rFonts w:eastAsiaTheme="majorEastAsia" w:cstheme="majorBidi"/>
+      <w:rFonts w:eastAsia="" w:cs="" w:cstheme="majorBidi" w:eastAsiaTheme="majorEastAsia"/>
       <w:iCs/>
     </w:rPr>
   </w:style>
@@ -1850,15 +1764,15 @@
     <w:uiPriority w:val="9"/>
     <w:unhideWhenUsed/>
     <w:qFormat/>
-    <w:rsid w:val="00E0014C"/>
-    <w:pPr>
-      <w:keepNext/>
+    <w:rsid w:val="00e0014c"/>
+    <w:pPr>
+      <w:keepNext w:val="true"/>
       <w:keepLines/>
       <w:spacing w:before="200" w:after="0"/>
       <w:outlineLvl w:val="5"/>
     </w:pPr>
     <w:rPr>
-      <w:rFonts w:eastAsiaTheme="majorEastAsia" w:cstheme="majorBidi"/>
+      <w:rFonts w:eastAsia="" w:cs="" w:cstheme="majorBidi" w:eastAsiaTheme="majorEastAsia"/>
     </w:rPr>
   </w:style>
   <w:style w:type="paragraph" w:styleId="Heading7">
@@ -1868,15 +1782,15 @@
     <w:uiPriority w:val="9"/>
     <w:unhideWhenUsed/>
     <w:qFormat/>
-    <w:rsid w:val="00E0014C"/>
-    <w:pPr>
-      <w:keepNext/>
+    <w:rsid w:val="00e0014c"/>
+    <w:pPr>
+      <w:keepNext w:val="true"/>
       <w:keepLines/>
       <w:spacing w:before="200" w:after="0"/>
       <w:outlineLvl w:val="6"/>
     </w:pPr>
     <w:rPr>
-      <w:rFonts w:eastAsiaTheme="majorEastAsia" w:cstheme="majorBidi"/>
+      <w:rFonts w:eastAsia="" w:cs="" w:cstheme="majorBidi" w:eastAsiaTheme="majorEastAsia"/>
     </w:rPr>
   </w:style>
   <w:style w:type="paragraph" w:styleId="Heading8">
@@ -1886,15 +1800,15 @@
     <w:uiPriority w:val="9"/>
     <w:unhideWhenUsed/>
     <w:qFormat/>
-    <w:rsid w:val="00E0014C"/>
-    <w:pPr>
-      <w:keepNext/>
+    <w:rsid w:val="00e0014c"/>
+    <w:pPr>
+      <w:keepNext w:val="true"/>
       <w:keepLines/>
       <w:spacing w:before="200" w:after="0"/>
       <w:outlineLvl w:val="7"/>
     </w:pPr>
     <w:rPr>
-      <w:rFonts w:eastAsiaTheme="majorEastAsia" w:cstheme="majorBidi"/>
+      <w:rFonts w:eastAsia="" w:cs="" w:cstheme="majorBidi" w:eastAsiaTheme="majorEastAsia"/>
     </w:rPr>
   </w:style>
   <w:style w:type="paragraph" w:styleId="Heading9">
@@ -1904,22 +1818,601 @@
     <w:uiPriority w:val="9"/>
     <w:unhideWhenUsed/>
     <w:qFormat/>
-    <w:rsid w:val="00E0014C"/>
-    <w:pPr>
-      <w:keepNext/>
+    <w:rsid w:val="00e0014c"/>
+    <w:pPr>
+      <w:keepNext w:val="true"/>
       <w:keepLines/>
       <w:spacing w:before="200" w:after="0"/>
       <w:outlineLvl w:val="8"/>
     </w:pPr>
     <w:rPr>
-      <w:rFonts w:eastAsiaTheme="majorEastAsia" w:cstheme="majorBidi"/>
+      <w:rFonts w:eastAsia="" w:cs="" w:cstheme="majorBidi" w:eastAsiaTheme="majorEastAsia"/>
     </w:rPr>
   </w:style>
-  <w:style w:type="character" w:default="1" w:styleId="DefaultParagraphFont">
+  <w:style w:type="character" w:styleId="DefaultParagraphFont" w:default="1">
     <w:name w:val="Default Paragraph Font"/>
     <w:uiPriority w:val="1"/>
     <w:semiHidden/>
     <w:unhideWhenUsed/>
+    <w:qFormat/>
+    <w:rPr/>
+  </w:style>
+  <w:style w:type="character" w:styleId="CaptionChar" w:customStyle="1">
+    <w:name w:val="Caption Char"/>
+    <w:basedOn w:val="DefaultParagraphFont"/>
+    <w:link w:val="Caption"/>
+    <w:qFormat/>
+    <w:rPr/>
+  </w:style>
+  <w:style w:type="character" w:styleId="VerbatimChar" w:customStyle="1">
+    <w:name w:val="Verbatim Char"/>
+    <w:basedOn w:val="CaptionChar"/>
+    <w:qFormat/>
+    <w:rPr>
+      <w:rFonts w:ascii="Consolas" w:hAnsi="Consolas"/>
+      <w:sz w:val="22"/>
+    </w:rPr>
+  </w:style>
+  <w:style w:type="character" w:styleId="SectionNumber" w:customStyle="1">
+    <w:name w:val="Section Number"/>
+    <w:basedOn w:val="CaptionChar"/>
+    <w:qFormat/>
+    <w:rPr/>
+  </w:style>
+  <w:style w:type="character" w:styleId="FootnoteCharacters">
+    <w:name w:val="Footnote Characters"/>
+    <w:basedOn w:val="CaptionChar"/>
+    <w:qFormat/>
+    <w:rPr>
+      <w:vertAlign w:val="superscript"/>
+    </w:rPr>
+  </w:style>
+  <w:style w:type="character" w:styleId="FootnoteReference">
+    <w:name w:val="footnote reference"/>
+    <w:rPr>
+      <w:vertAlign w:val="superscript"/>
+    </w:rPr>
+  </w:style>
+  <w:style w:type="character" w:styleId="Hyperlink">
+    <w:name w:val="Hyperlink"/>
+    <w:basedOn w:val="CaptionChar"/>
+    <w:uiPriority w:val="99"/>
+    <w:rsid w:val="00e0014c"/>
+    <w:rPr>
+      <w:rFonts w:ascii="Proxima Nova Rg" w:hAnsi="Proxima Nova Rg"/>
+      <w:color w:themeColor="accent1" w:val="4F81BD"/>
+    </w:rPr>
+  </w:style>
+  <w:style w:type="character" w:styleId="DateChar" w:customStyle="1">
+    <w:name w:val="Date Char"/>
+    <w:basedOn w:val="DefaultParagraphFont"/>
+    <w:link w:val="Date"/>
+    <w:qFormat/>
+    <w:rsid w:val="001316d3"/>
+    <w:rPr>
+      <w:rFonts w:ascii="Proxima Nova Rg" w:hAnsi="Proxima Nova Rg"/>
+    </w:rPr>
+  </w:style>
+  <w:style w:type="character" w:styleId="MessageHeaderChar" w:customStyle="1">
+    <w:name w:val="Message Header Char"/>
+    <w:basedOn w:val="DefaultParagraphFont"/>
+    <w:link w:val="MessageHeader"/>
+    <w:qFormat/>
+    <w:rsid w:val="006a5b1c"/>
+    <w:rPr>
+      <w:rFonts w:ascii="Arial" w:hAnsi="Arial" w:eastAsia="" w:cs="" w:cstheme="majorBidi" w:eastAsiaTheme="majorEastAsia"/>
+      <w:shd w:fill="CCCCCC" w:val="clear"/>
+    </w:rPr>
+  </w:style>
+  <w:style w:type="character" w:styleId="HeaderChar" w:customStyle="1">
+    <w:name w:val="Header Char"/>
+    <w:basedOn w:val="DefaultParagraphFont"/>
+    <w:link w:val="Header"/>
+    <w:uiPriority w:val="99"/>
+    <w:qFormat/>
+    <w:rsid w:val="00dd6a1b"/>
+    <w:rPr/>
+  </w:style>
+  <w:style w:type="character" w:styleId="FooterChar" w:customStyle="1">
+    <w:name w:val="Footer Char"/>
+    <w:basedOn w:val="DefaultParagraphFont"/>
+    <w:link w:val="Footer"/>
+    <w:uiPriority w:val="99"/>
+    <w:qFormat/>
+    <w:rsid w:val="002e7393"/>
+    <w:rPr>
+      <w:rFonts w:ascii="Proxima Nova Rg" w:hAnsi="Proxima Nova Rg"/>
+      <w:sz w:val="22"/>
+    </w:rPr>
+  </w:style>
+  <w:style w:type="character" w:styleId="PlaceholderText">
+    <w:name w:val="Placeholder Text"/>
+    <w:basedOn w:val="DefaultParagraphFont"/>
+    <w:qFormat/>
+    <w:rsid w:val="00603011"/>
+    <w:rPr>
+      <w:color w:val="666666"/>
+    </w:rPr>
+  </w:style>
+  <w:style w:type="character" w:styleId="EmailSignatureChar" w:customStyle="1">
+    <w:name w:val="Email Signature Char"/>
+    <w:basedOn w:val="DefaultParagraphFont"/>
+    <w:link w:val="E-mailSignature"/>
+    <w:qFormat/>
+    <w:rsid w:val="00e61719"/>
+    <w:rPr>
+      <w:rFonts w:ascii="Proxima Nova Rg" w:hAnsi="Proxima Nova Rg" w:eastAsia="" w:cs="Times New Roman (Body CS)" w:eastAsiaTheme="minorEastAsia"/>
+      <w:kern w:val="2"/>
+      <w:sz w:val="22"/>
+    </w:rPr>
+  </w:style>
+  <w:style w:type="character" w:styleId="IndexLink">
+    <w:name w:val="Index Link"/>
+    <w:qFormat/>
+    <w:rPr/>
+  </w:style>
+  <w:style w:type="character" w:styleId="EndnoteReference">
+    <w:name w:val="endnote reference"/>
+    <w:rPr>
+      <w:vertAlign w:val="superscript"/>
+    </w:rPr>
+  </w:style>
+  <w:style w:type="character" w:styleId="EndnoteCharacters">
+    <w:name w:val="Endnote Characters"/>
+    <w:qFormat/>
+    <w:rPr/>
+  </w:style>
+  <w:style w:type="paragraph" w:styleId="Heading">
+    <w:name w:val="Heading"/>
+    <w:basedOn w:val="Normal"/>
+    <w:next w:val="BodyText"/>
+    <w:qFormat/>
+    <w:pPr>
+      <w:keepNext w:val="true"/>
+      <w:spacing w:before="240" w:after="120"/>
+    </w:pPr>
+    <w:rPr>
+      <w:rFonts w:ascii="Liberation Sans" w:hAnsi="Liberation Sans" w:eastAsia="Arial Unicode MS" w:cs="Arial Unicode MS"/>
+      <w:sz w:val="28"/>
+      <w:szCs w:val="28"/>
+    </w:rPr>
+  </w:style>
+  <w:style w:type="paragraph" w:styleId="BodyText">
+    <w:name w:val="Body Text"/>
+    <w:basedOn w:val="Normal"/>
+    <w:qFormat/>
+    <w:rsid w:val="00e0014c"/>
+    <w:pPr>
+      <w:spacing w:before="180" w:after="180"/>
+    </w:pPr>
+    <w:rPr/>
+  </w:style>
+  <w:style w:type="paragraph" w:styleId="List">
+    <w:name w:val="List"/>
+    <w:basedOn w:val="BodyText"/>
+    <w:pPr/>
+    <w:rPr>
+      <w:rFonts w:cs="Arial Unicode MS"/>
+    </w:rPr>
+  </w:style>
+  <w:style w:type="paragraph" w:styleId="Caption">
+    <w:name w:val="caption"/>
+    <w:basedOn w:val="Normal"/>
+    <w:link w:val="CaptionChar"/>
+    <w:qFormat/>
+    <w:pPr>
+      <w:spacing w:before="0" w:after="120"/>
+    </w:pPr>
+    <w:rPr>
+      <w:i/>
+    </w:rPr>
+  </w:style>
+  <w:style w:type="paragraph" w:styleId="Index">
+    <w:name w:val="Index"/>
+    <w:basedOn w:val="Normal"/>
+    <w:qFormat/>
+    <w:pPr>
+      <w:suppressLineNumbers/>
+    </w:pPr>
+    <w:rPr>
+      <w:rFonts w:cs="Arial Unicode MS"/>
+    </w:rPr>
+  </w:style>
+  <w:style w:type="paragraph" w:styleId="FirstParagraph" w:customStyle="1">
+    <w:name w:val="First Paragraph"/>
+    <w:basedOn w:val="BodyText"/>
+    <w:next w:val="BodyText"/>
+    <w:qFormat/>
+    <w:rsid w:val="00e0014c"/>
+    <w:pPr/>
+    <w:rPr/>
+  </w:style>
+  <w:style w:type="paragraph" w:styleId="Compact" w:customStyle="1">
+    <w:name w:val="Compact"/>
+    <w:basedOn w:val="BodyText"/>
+    <w:qFormat/>
+    <w:pPr>
+      <w:spacing w:before="36" w:after="36"/>
+    </w:pPr>
+    <w:rPr/>
+  </w:style>
+  <w:style w:type="paragraph" w:styleId="Title">
+    <w:name w:val="Title"/>
+    <w:basedOn w:val="Normal"/>
+    <w:next w:val="BodyText"/>
+    <w:qFormat/>
+    <w:rsid w:val="001316d3"/>
+    <w:pPr>
+      <w:keepNext w:val="true"/>
+      <w:keepLines/>
+      <w:spacing w:beforeAutospacing="1" w:afterAutospacing="1"/>
+    </w:pPr>
+    <w:rPr>
+      <w:rFonts w:eastAsia="" w:cs="" w:cstheme="majorBidi" w:eastAsiaTheme="majorEastAsia"/>
+      <w:b/>
+      <w:bCs/>
+      <w:sz w:val="36"/>
+      <w:szCs w:val="36"/>
+    </w:rPr>
+  </w:style>
+  <w:style w:type="paragraph" w:styleId="Subtitle">
+    <w:name w:val="Subtitle"/>
+    <w:basedOn w:val="Title"/>
+    <w:next w:val="BodyText"/>
+    <w:qFormat/>
+    <w:rsid w:val="001316d3"/>
+    <w:pPr/>
+    <w:rPr>
+      <w:color w:themeColor="text1" w:val="000000"/>
+      <w:sz w:val="28"/>
+      <w:szCs w:val="30"/>
+    </w:rPr>
+  </w:style>
+  <w:style w:type="paragraph" w:styleId="Author" w:customStyle="1">
+    <w:name w:val="Author"/>
+    <w:next w:val="BodyText"/>
+    <w:qFormat/>
+    <w:rsid w:val="00e61719"/>
+    <w:pPr>
+      <w:keepNext w:val="true"/>
+      <w:keepLines/>
+      <w:widowControl/>
+      <w:bidi w:val="0"/>
+      <w:spacing w:lineRule="atLeast" w:line="240" w:before="0" w:after="0"/>
+      <w:jc w:val="left"/>
+    </w:pPr>
+    <w:rPr>
+      <w:rFonts w:ascii="Proxima Nova Rg" w:hAnsi="Proxima Nova Rg" w:eastAsia="Cambria" w:cs="" w:cstheme="minorBidi" w:eastAsiaTheme="minorHAnsi"/>
+      <w:color w:val="auto"/>
+      <w:kern w:val="0"/>
+      <w:sz w:val="24"/>
+      <w:szCs w:val="24"/>
+      <w:lang w:val="en-US" w:eastAsia="en-US" w:bidi="ar-SA"/>
+    </w:rPr>
+  </w:style>
+  <w:style w:type="paragraph" w:styleId="Date">
+    <w:name w:val="Date"/>
+    <w:next w:val="BodyText"/>
+    <w:link w:val="DateChar"/>
+    <w:qFormat/>
+    <w:rsid w:val="001316d3"/>
+    <w:pPr>
+      <w:keepNext w:val="true"/>
+      <w:keepLines/>
+      <w:widowControl/>
+      <w:bidi w:val="0"/>
+      <w:spacing w:before="0" w:after="200"/>
+      <w:jc w:val="left"/>
+    </w:pPr>
+    <w:rPr>
+      <w:rFonts w:ascii="Proxima Nova Rg" w:hAnsi="Proxima Nova Rg" w:eastAsia="Cambria" w:cs="" w:cstheme="minorBidi" w:eastAsiaTheme="minorHAnsi"/>
+      <w:color w:val="auto"/>
+      <w:kern w:val="0"/>
+      <w:sz w:val="24"/>
+      <w:szCs w:val="24"/>
+      <w:lang w:val="en-US" w:eastAsia="en-US" w:bidi="ar-SA"/>
+    </w:rPr>
+  </w:style>
+  <w:style w:type="paragraph" w:styleId="AbstractTitle" w:customStyle="1">
+    <w:name w:val="Abstract Title"/>
+    <w:basedOn w:val="Normal"/>
+    <w:next w:val="Abstract"/>
+    <w:qFormat/>
+    <w:rsid w:val="00e0014c"/>
+    <w:pPr>
+      <w:keepNext w:val="true"/>
+      <w:keepLines/>
+      <w:pageBreakBefore/>
+      <w:spacing w:before="300" w:after="0"/>
+      <w:jc w:val="center"/>
+    </w:pPr>
+    <w:rPr>
+      <w:b/>
+      <w:color w:val="00808C"/>
+      <w:sz w:val="20"/>
+      <w:szCs w:val="20"/>
+    </w:rPr>
+  </w:style>
+  <w:style w:type="paragraph" w:styleId="Abstract" w:customStyle="1">
+    <w:name w:val="Abstract"/>
+    <w:basedOn w:val="Normal"/>
+    <w:next w:val="BodyText"/>
+    <w:qFormat/>
+    <w:rsid w:val="00e0014c"/>
+    <w:pPr>
+      <w:keepNext w:val="true"/>
+      <w:keepLines/>
+      <w:spacing w:before="100" w:after="300"/>
+      <w:jc w:val="both"/>
+    </w:pPr>
+    <w:rPr>
+      <w:sz w:val="20"/>
+      <w:szCs w:val="20"/>
+    </w:rPr>
+  </w:style>
+  <w:style w:type="paragraph" w:styleId="Bibliography">
+    <w:name w:val="Bibliography"/>
+    <w:basedOn w:val="Normal"/>
+    <w:qFormat/>
+    <w:rsid w:val="006a5b1c"/>
+    <w:pPr/>
+    <w:rPr/>
+  </w:style>
+  <w:style w:type="paragraph" w:styleId="BlockText">
+    <w:name w:val="Block Text"/>
+    <w:basedOn w:val="BodyText"/>
+    <w:next w:val="BodyText"/>
+    <w:uiPriority w:val="9"/>
+    <w:unhideWhenUsed/>
+    <w:qFormat/>
+    <w:pPr>
+      <w:spacing w:before="100" w:after="100"/>
+      <w:ind w:left="480" w:right="480"/>
+    </w:pPr>
+    <w:rPr/>
+  </w:style>
+  <w:style w:type="paragraph" w:styleId="FootnoteText">
+    <w:name w:val="footnote text"/>
+    <w:basedOn w:val="Normal"/>
+    <w:uiPriority w:val="9"/>
+    <w:unhideWhenUsed/>
+    <w:qFormat/>
+    <w:rsid w:val="00e0014c"/>
+    <w:pPr/>
+    <w:rPr/>
+  </w:style>
+  <w:style w:type="paragraph" w:styleId="FootnoteBlockText" w:customStyle="1">
+    <w:name w:val="Footnote Block Text"/>
+    <w:uiPriority w:val="9"/>
+    <w:unhideWhenUsed/>
+    <w:qFormat/>
+    <w:pPr>
+      <w:widowControl/>
+      <w:bidi w:val="0"/>
+      <w:spacing w:before="100" w:after="100"/>
+      <w:ind w:left="480" w:right="480"/>
+      <w:jc w:val="left"/>
+    </w:pPr>
+    <w:rPr>
+      <w:rFonts w:ascii="Cambria" w:hAnsi="Cambria" w:eastAsia="Cambria" w:cs="" w:asciiTheme="minorHAnsi" w:cstheme="minorBidi" w:eastAsiaTheme="minorHAnsi" w:hAnsiTheme="minorHAnsi"/>
+      <w:color w:val="auto"/>
+      <w:kern w:val="0"/>
+      <w:sz w:val="24"/>
+      <w:szCs w:val="24"/>
+      <w:lang w:val="en-US" w:eastAsia="en-US" w:bidi="ar-SA"/>
+    </w:rPr>
+  </w:style>
+  <w:style w:type="paragraph" w:styleId="DefinitionTerm" w:customStyle="1">
+    <w:name w:val="Definition Term"/>
+    <w:basedOn w:val="Normal"/>
+    <w:next w:val="Definition"/>
+    <w:qFormat/>
+    <w:rsid w:val="00e0014c"/>
+    <w:pPr>
+      <w:keepNext w:val="true"/>
+      <w:keepLines/>
+      <w:spacing w:before="0" w:after="0"/>
+    </w:pPr>
+    <w:rPr>
+      <w:b/>
+    </w:rPr>
+  </w:style>
+  <w:style w:type="paragraph" w:styleId="Definition" w:customStyle="1">
+    <w:name w:val="Definition"/>
+    <w:basedOn w:val="Normal"/>
+    <w:qFormat/>
+    <w:rsid w:val="00e0014c"/>
+    <w:pPr/>
+    <w:rPr/>
+  </w:style>
+  <w:style w:type="paragraph" w:styleId="TableCaption" w:customStyle="1">
+    <w:name w:val="Table Caption"/>
+    <w:basedOn w:val="Caption"/>
+    <w:qFormat/>
+    <w:rsid w:val="00e0014c"/>
+    <w:pPr>
+      <w:keepNext w:val="true"/>
+    </w:pPr>
+    <w:rPr/>
+  </w:style>
+  <w:style w:type="paragraph" w:styleId="ImageCaption" w:customStyle="1">
+    <w:name w:val="Image Caption"/>
+    <w:basedOn w:val="Caption"/>
+    <w:qFormat/>
+    <w:rsid w:val="00df0883"/>
+    <w:pPr/>
+    <w:rPr/>
+  </w:style>
+  <w:style w:type="paragraph" w:styleId="Figure" w:customStyle="1">
+    <w:name w:val="Figure"/>
+    <w:basedOn w:val="Normal"/>
+    <w:qFormat/>
+    <w:pPr/>
+    <w:rPr/>
+  </w:style>
+  <w:style w:type="paragraph" w:styleId="CaptionedFigure" w:customStyle="1">
+    <w:name w:val="Captioned Figure"/>
+    <w:basedOn w:val="Figure"/>
+    <w:qFormat/>
+    <w:pPr>
+      <w:keepNext w:val="true"/>
+    </w:pPr>
+    <w:rPr/>
+  </w:style>
+  <w:style w:type="paragraph" w:styleId="IndexHeading">
+    <w:name w:val="index heading"/>
+    <w:basedOn w:val="Heading"/>
+    <w:pPr/>
+    <w:rPr/>
+  </w:style>
+  <w:style w:type="paragraph" w:styleId="TOCHeading">
+    <w:name w:val="TOC Heading"/>
+    <w:basedOn w:val="Heading1"/>
+    <w:next w:val="BodyText"/>
+    <w:uiPriority w:val="39"/>
+    <w:unhideWhenUsed/>
+    <w:qFormat/>
+    <w:rsid w:val="00b21817"/>
+    <w:pPr>
+      <w:pageBreakBefore/>
+      <w:spacing w:lineRule="auto" w:line="259" w:before="240" w:after="0"/>
+      <w:outlineLvl w:val="9"/>
+    </w:pPr>
+    <w:rPr>
+      <w:bCs w:val="false"/>
+    </w:rPr>
+  </w:style>
+  <w:style w:type="paragraph" w:styleId="toaheading">
+    <w:name w:val="toa heading"/>
+    <w:basedOn w:val="Normal"/>
+    <w:next w:val="Normal"/>
+    <w:qFormat/>
+    <w:rsid w:val="00735f57"/>
+    <w:pPr>
+      <w:spacing w:before="120" w:after="200"/>
+    </w:pPr>
+    <w:rPr>
+      <w:rFonts w:eastAsia="" w:cs="" w:cstheme="majorBidi" w:eastAsiaTheme="majorEastAsia"/>
+      <w:b/>
+      <w:bCs/>
+      <w:color w:val="00808C"/>
+    </w:rPr>
+  </w:style>
+  <w:style w:type="paragraph" w:styleId="TOC1">
+    <w:name w:val="toc 1"/>
+    <w:basedOn w:val="Normal"/>
+    <w:next w:val="Normal"/>
+    <w:autoRedefine/>
+    <w:uiPriority w:val="39"/>
+    <w:rsid w:val="00735f57"/>
+    <w:pPr>
+      <w:spacing w:before="0" w:after="100"/>
+    </w:pPr>
+    <w:rPr/>
+  </w:style>
+  <w:style w:type="paragraph" w:styleId="TOC2">
+    <w:name w:val="toc 2"/>
+    <w:basedOn w:val="Normal"/>
+    <w:next w:val="Normal"/>
+    <w:autoRedefine/>
+    <w:uiPriority w:val="39"/>
+    <w:rsid w:val="00735f57"/>
+    <w:pPr>
+      <w:spacing w:before="0" w:after="100"/>
+      <w:ind w:left="240"/>
+    </w:pPr>
+    <w:rPr/>
+  </w:style>
+  <w:style w:type="paragraph" w:styleId="MessageHeader">
+    <w:name w:val="Message Header"/>
+    <w:basedOn w:val="Normal"/>
+    <w:link w:val="MessageHeaderChar"/>
+    <w:qFormat/>
+    <w:rsid w:val="006a5b1c"/>
+    <w:pPr>
+      <w:pBdr>
+        <w:top w:val="single" w:sz="6" w:space="1" w:color="000000"/>
+        <w:left w:val="single" w:sz="6" w:space="1" w:color="000000"/>
+        <w:bottom w:val="single" w:sz="6" w:space="1" w:color="000000"/>
+        <w:right w:val="single" w:sz="6" w:space="1" w:color="000000"/>
+      </w:pBdr>
+      <w:shd w:val="pct20" w:color="auto" w:fill="auto"/>
+      <w:spacing w:before="0" w:after="0"/>
+      <w:ind w:hanging="1134" w:left="1134"/>
+    </w:pPr>
+    <w:rPr>
+      <w:rFonts w:eastAsia="" w:cs="" w:cstheme="majorBidi" w:eastAsiaTheme="majorEastAsia"/>
+    </w:rPr>
+  </w:style>
+  <w:style w:type="paragraph" w:styleId="HeaderandFooter">
+    <w:name w:val="Header and Footer"/>
+    <w:basedOn w:val="Normal"/>
+    <w:qFormat/>
+    <w:pPr/>
+    <w:rPr/>
+  </w:style>
+  <w:style w:type="paragraph" w:styleId="Header">
+    <w:name w:val="header"/>
+    <w:basedOn w:val="Normal"/>
+    <w:link w:val="HeaderChar"/>
+    <w:uiPriority w:val="99"/>
+    <w:rsid w:val="00dd6a1b"/>
+    <w:pPr>
+      <w:tabs>
+        <w:tab w:val="clear" w:pos="720"/>
+        <w:tab w:val="center" w:pos="4513" w:leader="none"/>
+        <w:tab w:val="right" w:pos="9026" w:leader="none"/>
+      </w:tabs>
+      <w:spacing w:before="0" w:after="0"/>
+    </w:pPr>
+    <w:rPr/>
+  </w:style>
+  <w:style w:type="paragraph" w:styleId="Footer">
+    <w:name w:val="footer"/>
+    <w:basedOn w:val="Normal"/>
+    <w:link w:val="FooterChar"/>
+    <w:uiPriority w:val="99"/>
+    <w:rsid w:val="002e7393"/>
+    <w:pPr>
+      <w:tabs>
+        <w:tab w:val="clear" w:pos="720"/>
+        <w:tab w:val="center" w:pos="4513" w:leader="none"/>
+        <w:tab w:val="right" w:pos="9026" w:leader="none"/>
+      </w:tabs>
+      <w:spacing w:before="0" w:after="0"/>
+    </w:pPr>
+    <w:rPr/>
+  </w:style>
+  <w:style w:type="paragraph" w:styleId="TOC3">
+    <w:name w:val="toc 3"/>
+    <w:basedOn w:val="Normal"/>
+    <w:next w:val="Normal"/>
+    <w:autoRedefine/>
+    <w:uiPriority w:val="39"/>
+    <w:rsid w:val="00ac0fab"/>
+    <w:pPr>
+      <w:spacing w:before="0" w:after="100"/>
+      <w:ind w:left="480"/>
+    </w:pPr>
+    <w:rPr/>
+  </w:style>
+  <w:style w:type="paragraph" w:styleId="E-mailSignature">
+    <w:name w:val="E-mail Signature"/>
+    <w:basedOn w:val="Normal"/>
+    <w:link w:val="EmailSignatureChar"/>
+    <w:qFormat/>
+    <w:rsid w:val="00e61719"/>
+    <w:pPr>
+      <w:spacing w:before="0" w:after="0"/>
+    </w:pPr>
+    <w:rPr/>
+  </w:style>
+  <w:style w:type="numbering" w:styleId="NoList" w:default="1">
+    <w:name w:val="No List"/>
+    <w:uiPriority w:val="99"/>
+    <w:semiHidden/>
+    <w:unhideWhenUsed/>
+    <w:qFormat/>
   </w:style>
   <w:style w:type="table" w:default="1" w:styleId="TableNormal">
     <w:name w:val="Normal Table"/>
@@ -1927,7 +2420,6 @@
     <w:semiHidden/>
     <w:unhideWhenUsed/>
     <w:tblPr>
-      <w:tblInd w:w="0" w:type="dxa"/>
       <w:tblCellMar>
         <w:top w:w="0" w:type="dxa"/>
         <w:left w:w="108" w:type="dxa"/>
@@ -1936,189 +2428,25 @@
       </w:tblCellMar>
     </w:tblPr>
   </w:style>
-  <w:style w:type="numbering" w:default="1" w:styleId="NoList">
-    <w:name w:val="No List"/>
-    <w:uiPriority w:val="99"/>
-    <w:semiHidden/>
-    <w:unhideWhenUsed/>
-  </w:style>
-  <w:style w:type="paragraph" w:styleId="BodyText">
-    <w:name w:val="Body Text"/>
-    <w:basedOn w:val="Normal"/>
-    <w:qFormat/>
-    <w:rsid w:val="00E0014C"/>
-    <w:pPr>
-      <w:spacing w:before="180" w:after="180"/>
-    </w:pPr>
-  </w:style>
-  <w:style w:type="paragraph" w:customStyle="1" w:styleId="FirstParagraph">
-    <w:name w:val="First Paragraph"/>
-    <w:basedOn w:val="BodyText"/>
-    <w:next w:val="BodyText"/>
-    <w:qFormat/>
-    <w:rsid w:val="00E0014C"/>
-  </w:style>
-  <w:style w:type="paragraph" w:customStyle="1" w:styleId="Compact">
-    <w:name w:val="Compact"/>
-    <w:basedOn w:val="BodyText"/>
-    <w:qFormat/>
-    <w:pPr>
-      <w:spacing w:before="36" w:after="36"/>
-    </w:pPr>
-  </w:style>
-  <w:style w:type="paragraph" w:styleId="Title">
-    <w:name w:val="Title"/>
-    <w:basedOn w:val="Normal"/>
-    <w:next w:val="BodyText"/>
-    <w:qFormat/>
-    <w:rsid w:val="001316D3"/>
-    <w:pPr>
-      <w:keepNext/>
-      <w:keepLines/>
-      <w:spacing w:before="100" w:beforeAutospacing="1" w:after="100" w:afterAutospacing="1"/>
-    </w:pPr>
-    <w:rPr>
-      <w:rFonts w:eastAsiaTheme="majorEastAsia" w:cstheme="majorBidi"/>
-      <w:b/>
-      <w:bCs/>
-      <w:sz w:val="36"/>
-      <w:szCs w:val="36"/>
-    </w:rPr>
-  </w:style>
-  <w:style w:type="paragraph" w:styleId="Subtitle">
-    <w:name w:val="Subtitle"/>
-    <w:basedOn w:val="Title"/>
-    <w:next w:val="BodyText"/>
-    <w:qFormat/>
-    <w:rsid w:val="001316D3"/>
-    <w:rPr>
-      <w:color w:val="000000" w:themeColor="text1"/>
-      <w:sz w:val="28"/>
-      <w:szCs w:val="30"/>
-    </w:rPr>
-  </w:style>
-  <w:style w:type="paragraph" w:customStyle="1" w:styleId="Author">
-    <w:name w:val="Author"/>
-    <w:next w:val="BodyText"/>
-    <w:qFormat/>
-    <w:rsid w:val="00E61719"/>
-    <w:pPr>
-      <w:keepNext/>
-      <w:keepLines/>
-      <w:spacing w:after="0" w:line="240" w:lineRule="atLeast"/>
-    </w:pPr>
-    <w:rPr>
-      <w:rFonts w:ascii="Proxima Nova Rg" w:hAnsi="Proxima Nova Rg"/>
-    </w:rPr>
-  </w:style>
-  <w:style w:type="paragraph" w:styleId="Date">
-    <w:name w:val="Date"/>
-    <w:next w:val="BodyText"/>
-    <w:link w:val="DateChar"/>
-    <w:qFormat/>
-    <w:rsid w:val="001316D3"/>
-    <w:pPr>
-      <w:keepNext/>
-      <w:keepLines/>
-    </w:pPr>
-    <w:rPr>
-      <w:rFonts w:ascii="Proxima Nova Rg" w:hAnsi="Proxima Nova Rg"/>
-    </w:rPr>
-  </w:style>
-  <w:style w:type="paragraph" w:customStyle="1" w:styleId="AbstractTitle">
-    <w:name w:val="Abstract Title"/>
-    <w:basedOn w:val="Normal"/>
-    <w:next w:val="Abstract"/>
-    <w:qFormat/>
-    <w:rsid w:val="00E0014C"/>
-    <w:pPr>
-      <w:keepNext/>
-      <w:keepLines/>
-      <w:pageBreakBefore/>
-      <w:spacing w:before="300" w:after="0"/>
-      <w:jc w:val="center"/>
-    </w:pPr>
-    <w:rPr>
-      <w:b/>
-      <w:color w:val="00808C"/>
-      <w:sz w:val="20"/>
-      <w:szCs w:val="20"/>
-    </w:rPr>
-  </w:style>
-  <w:style w:type="paragraph" w:customStyle="1" w:styleId="Abstract">
-    <w:name w:val="Abstract"/>
-    <w:basedOn w:val="Normal"/>
-    <w:next w:val="BodyText"/>
-    <w:qFormat/>
-    <w:rsid w:val="00E0014C"/>
-    <w:pPr>
-      <w:keepNext/>
-      <w:keepLines/>
-      <w:spacing w:before="100" w:after="300"/>
-      <w:jc w:val="both"/>
-    </w:pPr>
-    <w:rPr>
-      <w:sz w:val="20"/>
-      <w:szCs w:val="20"/>
-    </w:rPr>
-  </w:style>
-  <w:style w:type="paragraph" w:styleId="Bibliography">
-    <w:name w:val="Bibliography"/>
-    <w:basedOn w:val="Normal"/>
-    <w:qFormat/>
-    <w:rsid w:val="006A5B1C"/>
-  </w:style>
-  <w:style w:type="paragraph" w:styleId="BlockText">
-    <w:name w:val="Block Text"/>
-    <w:basedOn w:val="BodyText"/>
-    <w:next w:val="BodyText"/>
-    <w:uiPriority w:val="9"/>
-    <w:unhideWhenUsed/>
-    <w:qFormat/>
-    <w:pPr>
-      <w:spacing w:before="100" w:after="100"/>
-      <w:ind w:left="480" w:right="480"/>
-    </w:pPr>
-  </w:style>
-  <w:style w:type="paragraph" w:styleId="FootnoteText">
-    <w:name w:val="footnote text"/>
-    <w:basedOn w:val="Normal"/>
-    <w:uiPriority w:val="9"/>
-    <w:unhideWhenUsed/>
-    <w:qFormat/>
-    <w:rsid w:val="00E0014C"/>
-  </w:style>
-  <w:style w:type="paragraph" w:customStyle="1" w:styleId="FootnoteBlockText">
-    <w:name w:val="Footnote Block Text"/>
-    <w:uiPriority w:val="9"/>
-    <w:unhideWhenUsed/>
-    <w:qFormat/>
-    <w:pPr>
-      <w:spacing w:before="100" w:after="100"/>
-      <w:ind w:left="480" w:right="480"/>
-    </w:pPr>
-  </w:style>
   <w:style w:type="table" w:customStyle="1" w:styleId="Table">
     <w:name w:val="Table"/>
     <w:semiHidden/>
     <w:unhideWhenUsed/>
     <w:qFormat/>
-    <w:rsid w:val="009A4661"/>
+    <w:rsid w:val="009a4661"/>
     <w:rPr>
-      <w:rFonts w:ascii="Arial" w:hAnsi="Arial"/>
       <w:sz w:val="20"/>
       <w:szCs w:val="20"/>
       <w:lang w:val="en-AU" w:eastAsia="en-AU"/>
     </w:rPr>
     <w:tblPr>
-      <w:tblInd w:w="0" w:type="dxa"/>
       <w:tblBorders>
-        <w:top w:val="single" w:sz="4" w:space="0" w:color="FFFFFF" w:themeColor="background1"/>
-        <w:left w:val="single" w:sz="4" w:space="0" w:color="FFFFFF" w:themeColor="background1"/>
-        <w:bottom w:val="single" w:sz="4" w:space="0" w:color="FFFFFF" w:themeColor="background1"/>
-        <w:right w:val="single" w:sz="4" w:space="0" w:color="FFFFFF" w:themeColor="background1"/>
-        <w:insideH w:val="single" w:sz="4" w:space="0" w:color="FFFFFF" w:themeColor="background1"/>
-        <w:insideV w:val="single" w:sz="4" w:space="0" w:color="FFFFFF" w:themeColor="background1"/>
+        <w:top w:val="single" w:color="FFFFFF" w:themeColor="background1" w:sz="4" w:space="0"/>
+        <w:left w:val="single" w:color="FFFFFF" w:themeColor="background1" w:sz="4" w:space="0"/>
+        <w:bottom w:val="single" w:color="FFFFFF" w:themeColor="background1" w:sz="4" w:space="0"/>
+        <w:right w:val="single" w:color="FFFFFF" w:themeColor="background1" w:sz="4" w:space="0"/>
+        <w:insideH w:val="single" w:color="FFFFFF" w:themeColor="background1" w:sz="4" w:space="0"/>
+        <w:insideV w:val="single" w:color="FFFFFF" w:themeColor="background1" w:sz="4" w:space="0"/>
       </w:tblBorders>
       <w:tblCellMar>
         <w:top w:w="0" w:type="dxa"/>
@@ -2140,291 +2468,23 @@
       </w:tcPr>
     </w:tblStylePr>
   </w:style>
-  <w:style w:type="paragraph" w:customStyle="1" w:styleId="DefinitionTerm">
-    <w:name w:val="Definition Term"/>
-    <w:basedOn w:val="Normal"/>
-    <w:next w:val="Definition"/>
-    <w:rsid w:val="00E0014C"/>
-    <w:pPr>
-      <w:keepNext/>
-      <w:keepLines/>
-      <w:spacing w:after="0"/>
-    </w:pPr>
-    <w:rPr>
-      <w:b/>
-    </w:rPr>
-  </w:style>
-  <w:style w:type="paragraph" w:customStyle="1" w:styleId="Definition">
-    <w:name w:val="Definition"/>
-    <w:basedOn w:val="Normal"/>
-    <w:rsid w:val="00E0014C"/>
-  </w:style>
-  <w:style w:type="paragraph" w:styleId="Caption">
-    <w:name w:val="caption"/>
-    <w:basedOn w:val="Normal"/>
-    <w:link w:val="CaptionChar"/>
-    <w:pPr>
-      <w:spacing w:after="120"/>
-    </w:pPr>
-    <w:rPr>
-      <w:i/>
-    </w:rPr>
-  </w:style>
-  <w:style w:type="paragraph" w:customStyle="1" w:styleId="TableCaption">
-    <w:name w:val="Table Caption"/>
-    <w:basedOn w:val="Caption"/>
-    <w:rsid w:val="00E0014C"/>
-    <w:pPr>
-      <w:keepNext/>
-    </w:pPr>
-  </w:style>
-  <w:style w:type="paragraph" w:customStyle="1" w:styleId="ImageCaption">
-    <w:name w:val="Image Caption"/>
-    <w:basedOn w:val="Caption"/>
-    <w:rsid w:val="00DF0883"/>
-  </w:style>
-  <w:style w:type="paragraph" w:customStyle="1" w:styleId="Figure">
-    <w:name w:val="Figure"/>
-    <w:basedOn w:val="Normal"/>
-  </w:style>
-  <w:style w:type="paragraph" w:customStyle="1" w:styleId="CaptionedFigure">
-    <w:name w:val="Captioned Figure"/>
-    <w:basedOn w:val="Figure"/>
-    <w:pPr>
-      <w:keepNext/>
-    </w:pPr>
-  </w:style>
-  <w:style w:type="character" w:customStyle="1" w:styleId="CaptionChar">
-    <w:name w:val="Caption Char"/>
-    <w:basedOn w:val="DefaultParagraphFont"/>
-    <w:link w:val="Caption"/>
-  </w:style>
-  <w:style w:type="character" w:customStyle="1" w:styleId="VerbatimChar">
-    <w:name w:val="Verbatim Char"/>
-    <w:basedOn w:val="CaptionChar"/>
-    <w:rPr>
-      <w:rFonts w:ascii="Consolas" w:hAnsi="Consolas"/>
-      <w:sz w:val="22"/>
-    </w:rPr>
-  </w:style>
-  <w:style w:type="character" w:customStyle="1" w:styleId="SectionNumber">
-    <w:name w:val="Section Number"/>
-    <w:basedOn w:val="CaptionChar"/>
-  </w:style>
-  <w:style w:type="character" w:styleId="FootnoteReference">
-    <w:name w:val="footnote reference"/>
-    <w:basedOn w:val="CaptionChar"/>
-    <w:rPr>
-      <w:vertAlign w:val="superscript"/>
-    </w:rPr>
-  </w:style>
-  <w:style w:type="character" w:styleId="Hyperlink">
-    <w:name w:val="Hyperlink"/>
-    <w:basedOn w:val="CaptionChar"/>
-    <w:uiPriority w:val="99"/>
-    <w:rsid w:val="00E0014C"/>
-    <w:rPr>
-      <w:rFonts w:ascii="Proxima Nova Rg" w:hAnsi="Proxima Nova Rg"/>
-      <w:color w:val="4F81BD" w:themeColor="accent1"/>
-    </w:rPr>
-  </w:style>
-  <w:style w:type="paragraph" w:styleId="TOCHeading">
-    <w:name w:val="TOC Heading"/>
-    <w:basedOn w:val="Heading1"/>
-    <w:next w:val="BodyText"/>
-    <w:uiPriority w:val="39"/>
-    <w:unhideWhenUsed/>
-    <w:qFormat/>
-    <w:rsid w:val="00B21817"/>
-    <w:pPr>
-      <w:pageBreakBefore/>
-      <w:spacing w:before="240" w:line="259" w:lineRule="auto"/>
-      <w:outlineLvl w:val="9"/>
-    </w:pPr>
-    <w:rPr>
-      <w:bCs w:val="0"/>
-    </w:rPr>
-  </w:style>
-  <w:style w:type="character" w:customStyle="1" w:styleId="DateChar">
-    <w:name w:val="Date Char"/>
-    <w:basedOn w:val="DefaultParagraphFont"/>
-    <w:link w:val="Date"/>
-    <w:rsid w:val="001316D3"/>
-    <w:rPr>
-      <w:rFonts w:ascii="Proxima Nova Rg" w:hAnsi="Proxima Nova Rg"/>
-    </w:rPr>
-  </w:style>
-  <w:style w:type="paragraph" w:styleId="TOAHeading">
-    <w:name w:val="toa heading"/>
-    <w:basedOn w:val="Normal"/>
-    <w:next w:val="Normal"/>
-    <w:rsid w:val="00735F57"/>
-    <w:pPr>
-      <w:spacing w:before="120"/>
-    </w:pPr>
-    <w:rPr>
-      <w:rFonts w:eastAsiaTheme="majorEastAsia" w:cstheme="majorBidi"/>
-      <w:b/>
-      <w:bCs/>
-      <w:color w:val="00808C"/>
-    </w:rPr>
-  </w:style>
-  <w:style w:type="paragraph" w:styleId="TOC1">
-    <w:name w:val="toc 1"/>
-    <w:basedOn w:val="Normal"/>
-    <w:next w:val="Normal"/>
-    <w:autoRedefine/>
-    <w:uiPriority w:val="39"/>
-    <w:rsid w:val="00735F57"/>
-    <w:pPr>
-      <w:spacing w:after="100"/>
-    </w:pPr>
-  </w:style>
-  <w:style w:type="paragraph" w:styleId="TOC2">
-    <w:name w:val="toc 2"/>
-    <w:basedOn w:val="Normal"/>
-    <w:next w:val="Normal"/>
-    <w:autoRedefine/>
-    <w:uiPriority w:val="39"/>
-    <w:rsid w:val="00735F57"/>
-    <w:pPr>
-      <w:spacing w:after="100"/>
-      <w:ind w:left="240"/>
-    </w:pPr>
-  </w:style>
-  <w:style w:type="paragraph" w:styleId="MessageHeader">
-    <w:name w:val="Message Header"/>
-    <w:basedOn w:val="Normal"/>
-    <w:link w:val="MessageHeaderChar"/>
-    <w:rsid w:val="006A5B1C"/>
-    <w:pPr>
-      <w:pBdr>
-        <w:top w:val="single" w:sz="6" w:space="1" w:color="auto"/>
-        <w:left w:val="single" w:sz="6" w:space="1" w:color="auto"/>
-        <w:bottom w:val="single" w:sz="6" w:space="1" w:color="auto"/>
-        <w:right w:val="single" w:sz="6" w:space="1" w:color="auto"/>
-      </w:pBdr>
-      <w:shd w:val="pct20" w:color="auto" w:fill="auto"/>
-      <w:spacing w:after="0"/>
-      <w:ind w:left="1134" w:hanging="1134"/>
-    </w:pPr>
-    <w:rPr>
-      <w:rFonts w:eastAsiaTheme="majorEastAsia" w:cstheme="majorBidi"/>
-    </w:rPr>
-  </w:style>
-  <w:style w:type="character" w:customStyle="1" w:styleId="MessageHeaderChar">
-    <w:name w:val="Message Header Char"/>
-    <w:basedOn w:val="DefaultParagraphFont"/>
-    <w:link w:val="MessageHeader"/>
-    <w:rsid w:val="006A5B1C"/>
-    <w:rPr>
-      <w:rFonts w:ascii="Arial" w:eastAsiaTheme="majorEastAsia" w:hAnsi="Arial" w:cstheme="majorBidi"/>
-      <w:shd w:val="pct20" w:color="auto" w:fill="auto"/>
-    </w:rPr>
-  </w:style>
-  <w:style w:type="paragraph" w:styleId="Header">
-    <w:name w:val="header"/>
-    <w:basedOn w:val="Normal"/>
-    <w:link w:val="HeaderChar"/>
-    <w:uiPriority w:val="99"/>
-    <w:rsid w:val="00DD6A1B"/>
-    <w:pPr>
-      <w:tabs>
-        <w:tab w:val="center" w:pos="4513"/>
-        <w:tab w:val="right" w:pos="9026"/>
-      </w:tabs>
-      <w:spacing w:after="0"/>
-    </w:pPr>
-  </w:style>
-  <w:style w:type="character" w:customStyle="1" w:styleId="HeaderChar">
-    <w:name w:val="Header Char"/>
-    <w:basedOn w:val="DefaultParagraphFont"/>
-    <w:link w:val="Header"/>
-    <w:uiPriority w:val="99"/>
-    <w:rsid w:val="00DD6A1B"/>
-  </w:style>
-  <w:style w:type="paragraph" w:styleId="Footer">
-    <w:name w:val="footer"/>
-    <w:basedOn w:val="Normal"/>
-    <w:link w:val="FooterChar"/>
-    <w:uiPriority w:val="99"/>
-    <w:rsid w:val="002E7393"/>
-    <w:pPr>
-      <w:tabs>
-        <w:tab w:val="center" w:pos="4513"/>
-        <w:tab w:val="right" w:pos="9026"/>
-      </w:tabs>
-      <w:spacing w:after="0"/>
-    </w:pPr>
-  </w:style>
-  <w:style w:type="character" w:customStyle="1" w:styleId="FooterChar">
-    <w:name w:val="Footer Char"/>
-    <w:basedOn w:val="DefaultParagraphFont"/>
-    <w:link w:val="Footer"/>
-    <w:uiPriority w:val="99"/>
-    <w:rsid w:val="002E7393"/>
-    <w:rPr>
-      <w:rFonts w:ascii="Proxima Nova Rg" w:hAnsi="Proxima Nova Rg"/>
-      <w:sz w:val="22"/>
-    </w:rPr>
-  </w:style>
-  <w:style w:type="paragraph" w:styleId="TOC3">
-    <w:name w:val="toc 3"/>
-    <w:basedOn w:val="Normal"/>
-    <w:next w:val="Normal"/>
-    <w:autoRedefine/>
-    <w:uiPriority w:val="39"/>
-    <w:rsid w:val="00AC0FAB"/>
-    <w:pPr>
-      <w:spacing w:after="100"/>
-      <w:ind w:left="480"/>
-    </w:pPr>
-  </w:style>
   <w:style w:type="table" w:styleId="TableGrid">
     <w:name w:val="Table Grid"/>
     <w:basedOn w:val="TableNormal"/>
-    <w:rsid w:val="001316D3"/>
+    <w:rsid w:val="001316d3"/>
     <w:pPr>
       <w:spacing w:after="0"/>
     </w:pPr>
     <w:tblPr>
       <w:tblBorders>
-        <w:top w:val="single" w:sz="4" w:space="0" w:color="auto"/>
-        <w:left w:val="single" w:sz="4" w:space="0" w:color="auto"/>
-        <w:bottom w:val="single" w:sz="4" w:space="0" w:color="auto"/>
-        <w:right w:val="single" w:sz="4" w:space="0" w:color="auto"/>
-        <w:insideH w:val="single" w:sz="4" w:space="0" w:color="auto"/>
-        <w:insideV w:val="single" w:sz="4" w:space="0" w:color="auto"/>
+        <w:top w:val="single" w:color="auto" w:sz="4" w:space="0"/>
+        <w:left w:val="single" w:color="auto" w:sz="4" w:space="0"/>
+        <w:bottom w:val="single" w:color="auto" w:sz="4" w:space="0"/>
+        <w:right w:val="single" w:color="auto" w:sz="4" w:space="0"/>
+        <w:insideH w:val="single" w:color="auto" w:sz="4" w:space="0"/>
+        <w:insideV w:val="single" w:color="auto" w:sz="4" w:space="0"/>
       </w:tblBorders>
     </w:tblPr>
-  </w:style>
-  <w:style w:type="character" w:styleId="PlaceholderText">
-    <w:name w:val="Placeholder Text"/>
-    <w:basedOn w:val="DefaultParagraphFont"/>
-    <w:rsid w:val="00603011"/>
-    <w:rPr>
-      <w:color w:val="666666"/>
-    </w:rPr>
-  </w:style>
-  <w:style w:type="paragraph" w:styleId="EmailSignature">
-    <w:name w:val="E-mail Signature"/>
-    <w:basedOn w:val="Normal"/>
-    <w:link w:val="EmailSignatureChar"/>
-    <w:rsid w:val="00E61719"/>
-    <w:pPr>
-      <w:spacing w:after="0"/>
-    </w:pPr>
-  </w:style>
-  <w:style w:type="character" w:customStyle="1" w:styleId="EmailSignatureChar">
-    <w:name w:val="Email Signature Char"/>
-    <w:basedOn w:val="DefaultParagraphFont"/>
-    <w:link w:val="EmailSignature"/>
-    <w:rsid w:val="00E61719"/>
-    <w:rPr>
-      <w:rFonts w:ascii="Proxima Nova Rg" w:eastAsiaTheme="minorEastAsia" w:hAnsi="Proxima Nova Rg" w:cs="Times New Roman (Body CS)"/>
-      <w:kern w:val="21"/>
-      <w:sz w:val="22"/>
-    </w:rPr>
   </w:style>
 </w:styles>
 </file>
@@ -3075,14 +3135,14 @@
 </file>
 
 <file path=word/theme/theme1.xml><?xml version="1.0" encoding="utf-8"?>
-<a:theme xmlns:a="http://schemas.openxmlformats.org/drawingml/2006/main" name="Office Theme">
+<a:theme xmlns:a="http://schemas.openxmlformats.org/drawingml/2006/main" xmlns:r="http://schemas.openxmlformats.org/officeDocument/2006/relationships" name="Office Theme">
   <a:themeElements>
     <a:clrScheme name="Custom 4">
       <a:dk1>
-        <a:sysClr val="windowText" lastClr="000000"/>
+        <a:srgbClr val="000000"/>
       </a:dk1>
       <a:lt1>
-        <a:sysClr val="window" lastClr="FFFFFF"/>
+        <a:srgbClr val="FFFFFF"/>
       </a:lt1>
       <a:dk2>
         <a:srgbClr val="1F497D"/>
@@ -3117,282 +3177,151 @@
     </a:clrScheme>
     <a:fontScheme name="Office">
       <a:majorFont>
-        <a:latin typeface="Calibri"/>
+        <a:latin typeface="Calibri" pitchFamily="0" charset="1"/>
         <a:ea typeface=""/>
         <a:cs typeface=""/>
-        <a:font script="Jpan" typeface="ＭＳ ゴシック"/>
-        <a:font script="Hang" typeface="맑은 고딕"/>
-        <a:font script="Hans" typeface="宋体"/>
-        <a:font script="Hant" typeface="新細明體"/>
-        <a:font script="Arab" typeface="Times New Roman"/>
-        <a:font script="Hebr" typeface="Times New Roman"/>
-        <a:font script="Thai" typeface="Angsana New"/>
-        <a:font script="Ethi" typeface="Nyala"/>
-        <a:font script="Beng" typeface="Vrinda"/>
-        <a:font script="Gujr" typeface="Shruti"/>
-        <a:font script="Khmr" typeface="MoolBoran"/>
-        <a:font script="Knda" typeface="Tunga"/>
-        <a:font script="Guru" typeface="Raavi"/>
-        <a:font script="Cans" typeface="Euphemia"/>
-        <a:font script="Cher" typeface="Plantagenet Cherokee"/>
-        <a:font script="Yiii" typeface="Microsoft Yi Baiti"/>
-        <a:font script="Tibt" typeface="Microsoft Himalaya"/>
-        <a:font script="Thaa" typeface="MV Boli"/>
-        <a:font script="Deva" typeface="Mangal"/>
-        <a:font script="Telu" typeface="Gautami"/>
-        <a:font script="Taml" typeface="Latha"/>
-        <a:font script="Syrc" typeface="Estrangelo Edessa"/>
-        <a:font script="Orya" typeface="Kalinga"/>
-        <a:font script="Mlym" typeface="Kartika"/>
-        <a:font script="Laoo" typeface="DokChampa"/>
-        <a:font script="Sinh" typeface="Iskoola Pota"/>
-        <a:font script="Mong" typeface="Mongolian Baiti"/>
-        <a:font script="Viet" typeface="Times New Roman"/>
-        <a:font script="Uigh" typeface="Microsoft Uighur"/>
       </a:majorFont>
       <a:minorFont>
-        <a:latin typeface="Cambria"/>
+        <a:latin typeface="Cambria" pitchFamily="0" charset="1"/>
         <a:ea typeface=""/>
         <a:cs typeface=""/>
-        <a:font script="Jpan" typeface="ＭＳ 明朝"/>
-        <a:font script="Hang" typeface="맑은 고딕"/>
-        <a:font script="Hans" typeface="宋体"/>
-        <a:font script="Hant" typeface="新細明體"/>
-        <a:font script="Arab" typeface="Arial"/>
-        <a:font script="Hebr" typeface="Arial"/>
-        <a:font script="Thai" typeface="Cordia New"/>
-        <a:font script="Ethi" typeface="Nyala"/>
-        <a:font script="Beng" typeface="Vrinda"/>
-        <a:font script="Gujr" typeface="Shruti"/>
-        <a:font script="Khmr" typeface="DaunPenh"/>
-        <a:font script="Knda" typeface="Tunga"/>
-        <a:font script="Guru" typeface="Raavi"/>
-        <a:font script="Cans" typeface="Euphemia"/>
-        <a:font script="Cher" typeface="Plantagenet Cherokee"/>
-        <a:font script="Yiii" typeface="Microsoft Yi Baiti"/>
-        <a:font script="Tibt" typeface="Microsoft Himalaya"/>
-        <a:font script="Thaa" typeface="MV Boli"/>
-        <a:font script="Deva" typeface="Mangal"/>
-        <a:font script="Telu" typeface="Gautami"/>
-        <a:font script="Taml" typeface="Latha"/>
-        <a:font script="Syrc" typeface="Estrangelo Edessa"/>
-        <a:font script="Orya" typeface="Kalinga"/>
-        <a:font script="Mlym" typeface="Kartika"/>
-        <a:font script="Laoo" typeface="DokChampa"/>
-        <a:font script="Sinh" typeface="Iskoola Pota"/>
-        <a:font script="Mong" typeface="Mongolian Baiti"/>
-        <a:font script="Viet" typeface="Arial"/>
-        <a:font script="Uigh" typeface="Microsoft Uighur"/>
       </a:minorFont>
     </a:fontScheme>
-    <a:fmtScheme name="Office">
+    <a:fmtScheme>
       <a:fillStyleLst>
         <a:solidFill>
           <a:schemeClr val="phClr"/>
         </a:solidFill>
-        <a:gradFill rotWithShape="1">
+        <a:gradFill>
           <a:gsLst>
             <a:gs pos="0">
               <a:schemeClr val="phClr">
                 <a:tint val="50000"/>
-                <a:satMod val="300000"/>
               </a:schemeClr>
             </a:gs>
             <a:gs pos="35000">
               <a:schemeClr val="phClr">
                 <a:tint val="37000"/>
-                <a:satMod val="300000"/>
               </a:schemeClr>
             </a:gs>
             <a:gs pos="100000">
               <a:schemeClr val="phClr">
                 <a:tint val="15000"/>
-                <a:satMod val="350000"/>
               </a:schemeClr>
             </a:gs>
           </a:gsLst>
           <a:lin ang="16200000" scaled="1"/>
+          <a:tileRect l="0" t="0" r="0" b="0"/>
         </a:gradFill>
-        <a:gradFill rotWithShape="1">
+        <a:gradFill>
           <a:gsLst>
             <a:gs pos="0">
               <a:schemeClr val="phClr">
                 <a:tint val="100000"/>
                 <a:shade val="100000"/>
-                <a:satMod val="130000"/>
               </a:schemeClr>
             </a:gs>
             <a:gs pos="100000">
               <a:schemeClr val="phClr">
                 <a:tint val="50000"/>
                 <a:shade val="100000"/>
-                <a:satMod val="350000"/>
               </a:schemeClr>
             </a:gs>
           </a:gsLst>
           <a:lin ang="16200000" scaled="0"/>
+          <a:tileRect l="0" t="0" r="0" b="0"/>
         </a:gradFill>
       </a:fillStyleLst>
       <a:lnStyleLst>
         <a:ln w="9525" cap="flat" cmpd="sng" algn="ctr">
-          <a:solidFill>
-            <a:schemeClr val="phClr">
-              <a:shade val="95000"/>
-              <a:satMod val="105000"/>
-            </a:schemeClr>
-          </a:solidFill>
           <a:prstDash val="solid"/>
         </a:ln>
         <a:ln w="25400" cap="flat" cmpd="sng" algn="ctr">
-          <a:solidFill>
-            <a:schemeClr val="phClr"/>
-          </a:solidFill>
           <a:prstDash val="solid"/>
         </a:ln>
         <a:ln w="38100" cap="flat" cmpd="sng" algn="ctr">
-          <a:solidFill>
-            <a:schemeClr val="phClr"/>
-          </a:solidFill>
           <a:prstDash val="solid"/>
         </a:ln>
       </a:lnStyleLst>
       <a:effectStyleLst>
         <a:effectStyle>
-          <a:effectLst>
-            <a:outerShdw blurRad="40000" dist="20000" dir="5400000" rotWithShape="0">
-              <a:srgbClr val="000000">
-                <a:alpha val="38000"/>
-              </a:srgbClr>
-            </a:outerShdw>
-          </a:effectLst>
+          <a:effectLst/>
         </a:effectStyle>
         <a:effectStyle>
-          <a:effectLst>
-            <a:outerShdw blurRad="40000" dist="23000" dir="5400000" rotWithShape="0">
-              <a:srgbClr val="000000">
-                <a:alpha val="35000"/>
-              </a:srgbClr>
-            </a:outerShdw>
-          </a:effectLst>
+          <a:effectLst/>
         </a:effectStyle>
         <a:effectStyle>
-          <a:effectLst>
-            <a:outerShdw blurRad="40000" dist="23000" dir="5400000" rotWithShape="0">
-              <a:srgbClr val="000000">
-                <a:alpha val="35000"/>
-              </a:srgbClr>
-            </a:outerShdw>
-          </a:effectLst>
-          <a:scene3d>
-            <a:camera prst="orthographicFront">
-              <a:rot lat="0" lon="0" rev="0"/>
-            </a:camera>
-            <a:lightRig rig="threePt" dir="t">
-              <a:rot lat="0" lon="0" rev="1200000"/>
-            </a:lightRig>
-          </a:scene3d>
-          <a:sp3d>
-            <a:bevelT w="63500" h="25400"/>
-          </a:sp3d>
+          <a:effectLst/>
         </a:effectStyle>
       </a:effectStyleLst>
       <a:bgFillStyleLst>
         <a:solidFill>
           <a:schemeClr val="phClr"/>
         </a:solidFill>
-        <a:gradFill rotWithShape="1">
+        <a:gradFill>
           <a:gsLst>
             <a:gs pos="0">
               <a:schemeClr val="phClr">
                 <a:tint val="40000"/>
-                <a:satMod val="350000"/>
               </a:schemeClr>
             </a:gs>
             <a:gs pos="40000">
               <a:schemeClr val="phClr">
                 <a:tint val="45000"/>
                 <a:shade val="99000"/>
-                <a:satMod val="350000"/>
               </a:schemeClr>
             </a:gs>
             <a:gs pos="100000">
               <a:schemeClr val="phClr">
                 <a:shade val="20000"/>
-                <a:satMod val="255000"/>
               </a:schemeClr>
             </a:gs>
           </a:gsLst>
           <a:path path="circle">
             <a:fillToRect l="50000" t="-80000" r="50000" b="180000"/>
           </a:path>
+          <a:tileRect l="0" t="0" r="0" b="0"/>
         </a:gradFill>
-        <a:gradFill rotWithShape="1">
+        <a:gradFill>
           <a:gsLst>
             <a:gs pos="0">
               <a:schemeClr val="phClr">
                 <a:tint val="80000"/>
-                <a:satMod val="300000"/>
               </a:schemeClr>
             </a:gs>
             <a:gs pos="100000">
               <a:schemeClr val="phClr">
                 <a:shade val="30000"/>
-                <a:satMod val="200000"/>
               </a:schemeClr>
             </a:gs>
           </a:gsLst>
           <a:path path="circle">
             <a:fillToRect l="50000" t="50000" r="50000" b="50000"/>
           </a:path>
+          <a:tileRect l="0" t="0" r="0" b="0"/>
         </a:gradFill>
       </a:bgFillStyleLst>
     </a:fmtScheme>
   </a:themeElements>
-  <a:objectDefaults>
-    <a:spDef>
-      <a:spPr/>
-      <a:bodyPr/>
-      <a:lstStyle/>
-      <a:style>
-        <a:lnRef idx="1">
-          <a:schemeClr val="accent1"/>
-        </a:lnRef>
-        <a:fillRef idx="3">
-          <a:schemeClr val="accent1"/>
-        </a:fillRef>
-        <a:effectRef idx="2">
-          <a:schemeClr val="accent1"/>
-        </a:effectRef>
-        <a:fontRef idx="minor">
-          <a:schemeClr val="lt1"/>
-        </a:fontRef>
-      </a:style>
-    </a:spDef>
-    <a:lnDef>
-      <a:spPr/>
-      <a:bodyPr/>
-      <a:lstStyle/>
-      <a:style>
-        <a:lnRef idx="2">
-          <a:schemeClr val="accent1"/>
-        </a:lnRef>
-        <a:fillRef idx="0">
-          <a:schemeClr val="accent1"/>
-        </a:fillRef>
-        <a:effectRef idx="1">
-          <a:schemeClr val="accent1"/>
-        </a:effectRef>
-        <a:fontRef idx="minor">
-          <a:schemeClr val="tx1"/>
-        </a:fontRef>
-      </a:style>
-    </a:lnDef>
-  </a:objectDefaults>
-  <a:extraClrSchemeLst/>
 </a:theme>
 </file>
 
 <file path=customXml/item1.xml><?xml version="1.0" encoding="utf-8"?>
+<p:properties xmlns:p="http://schemas.microsoft.com/office/2006/metadata/properties" xmlns:xsi="http://www.w3.org/2001/XMLSchema-instance" xmlns:pc="http://schemas.microsoft.com/office/infopath/2007/PartnerControls">
+  <documentManagement>
+    <TaxCatchAll xmlns="c0a5e2f2-cbc9-444d-acb1-da3840c97b19" xsi:nil="true"/>
+    <lcf76f155ced4ddcb4097134ff3c332f xmlns="17fa7942-0d9f-40ad-9093-ce71332f67f5">
+      <Terms xmlns="http://schemas.microsoft.com/office/infopath/2007/PartnerControls"/>
+    </lcf76f155ced4ddcb4097134ff3c332f>
+  </documentManagement>
+</p:properties>
+</file>
+
+<file path=customXml/item2.xml><?xml version="1.0" encoding="utf-8"?>
+<b:Sources xmlns:b="http://schemas.openxmlformats.org/officeDocument/2006/bibliography" xmlns="http://schemas.openxmlformats.org/officeDocument/2006/bibliography" SelectedStyle="\APASixthEditionOfficeOnline.xsl" StyleName="APA" Version="6"/>
+</file>
+
+<file path=customXml/item3.xml><?xml version="1.0" encoding="utf-8"?>
 <ct:contentTypeSchema xmlns:ct="http://schemas.microsoft.com/office/2006/metadata/contentType" xmlns:ma="http://schemas.microsoft.com/office/2006/metadata/properties/metaAttributes" ct:_="" ma:_="" ma:contentTypeName="Document" ma:contentTypeID="0x010100BE37AAF0DD5F4448A506F792B732F161" ma:contentTypeVersion="15" ma:contentTypeDescription="Create a new document." ma:contentTypeScope="" ma:versionID="4f9eece326cb8525d683a1ea9e6b2db6">
   <xsd:schema xmlns:xsd="http://www.w3.org/2001/XMLSchema" xmlns:xs="http://www.w3.org/2001/XMLSchema" xmlns:p="http://schemas.microsoft.com/office/2006/metadata/properties" xmlns:ns2="17fa7942-0d9f-40ad-9093-ce71332f67f5" xmlns:ns3="c0a5e2f2-cbc9-444d-acb1-da3840c97b19" targetNamespace="http://schemas.microsoft.com/office/2006/metadata/properties" ma:root="true" ma:fieldsID="83691a1f05b251e90b3a47d11cb76344" ns2:_="" ns3:_="">
     <xsd:import namespace="17fa7942-0d9f-40ad-9093-ce71332f67f5"/>
@@ -3627,21 +3556,6 @@
 </ct:contentTypeSchema>
 </file>
 
-<file path=customXml/item2.xml><?xml version="1.0" encoding="utf-8"?>
-<b:Sources xmlns:b="http://schemas.openxmlformats.org/officeDocument/2006/bibliography" xmlns="http://schemas.openxmlformats.org/officeDocument/2006/bibliography" SelectedStyle="\APASixthEditionOfficeOnline.xsl" StyleName="APA" Version="6"/>
-</file>
-
-<file path=customXml/item3.xml><?xml version="1.0" encoding="utf-8"?>
-<p:properties xmlns:p="http://schemas.microsoft.com/office/2006/metadata/properties" xmlns:xsi="http://www.w3.org/2001/XMLSchema-instance" xmlns:pc="http://schemas.microsoft.com/office/infopath/2007/PartnerControls">
-  <documentManagement>
-    <TaxCatchAll xmlns="c0a5e2f2-cbc9-444d-acb1-da3840c97b19" xsi:nil="true"/>
-    <lcf76f155ced4ddcb4097134ff3c332f xmlns="17fa7942-0d9f-40ad-9093-ce71332f67f5">
-      <Terms xmlns="http://schemas.microsoft.com/office/infopath/2007/PartnerControls"/>
-    </lcf76f155ced4ddcb4097134ff3c332f>
-  </documentManagement>
-</p:properties>
-</file>
-
 <file path=customXml/item4.xml><?xml version="1.0" encoding="utf-8"?>
 <?mso-contentType ?>
 <FormTemplates xmlns="http://schemas.microsoft.com/sharepoint/v3/contenttype/forms">
@@ -3652,6 +3566,25 @@
 </file>
 
 <file path=customXml/itemProps1.xml><?xml version="1.0" encoding="utf-8"?>
+<ds:datastoreItem xmlns:ds="http://schemas.openxmlformats.org/officeDocument/2006/customXml" ds:itemID="{9E1FEEAB-B510-40FA-8CAE-DC1A4BCFB7AF}">
+  <ds:schemaRefs>
+    <ds:schemaRef ds:uri="http://schemas.microsoft.com/office/2006/metadata/properties"/>
+    <ds:schemaRef ds:uri="http://schemas.microsoft.com/office/infopath/2007/PartnerControls"/>
+    <ds:schemaRef ds:uri="c0a5e2f2-cbc9-444d-acb1-da3840c97b19"/>
+    <ds:schemaRef ds:uri="17fa7942-0d9f-40ad-9093-ce71332f67f5"/>
+  </ds:schemaRefs>
+</ds:datastoreItem>
+</file>
+
+<file path=customXml/itemProps2.xml><?xml version="1.0" encoding="utf-8"?>
+<ds:datastoreItem xmlns:ds="http://schemas.openxmlformats.org/officeDocument/2006/customXml" ds:itemID="{64FA4F1C-B507-441D-9669-8C36907E557A}">
+  <ds:schemaRefs>
+    <ds:schemaRef ds:uri="http://schemas.openxmlformats.org/officeDocument/2006/bibliography"/>
+  </ds:schemaRefs>
+</ds:datastoreItem>
+</file>
+
+<file path=customXml/itemProps3.xml><?xml version="1.0" encoding="utf-8"?>
 <ds:datastoreItem xmlns:ds="http://schemas.openxmlformats.org/officeDocument/2006/customXml" ds:itemID="{611802FA-C135-4E57-8C02-A7974D1B7D21}">
   <ds:schemaRefs>
     <ds:schemaRef ds:uri="http://schemas.microsoft.com/office/2006/metadata/contentType"/>
@@ -3670,25 +3603,6 @@
 </ds:datastoreItem>
 </file>
 
-<file path=customXml/itemProps2.xml><?xml version="1.0" encoding="utf-8"?>
-<ds:datastoreItem xmlns:ds="http://schemas.openxmlformats.org/officeDocument/2006/customXml" ds:itemID="{64FA4F1C-B507-441D-9669-8C36907E557A}">
-  <ds:schemaRefs>
-    <ds:schemaRef ds:uri="http://schemas.openxmlformats.org/officeDocument/2006/bibliography"/>
-  </ds:schemaRefs>
-</ds:datastoreItem>
-</file>
-
-<file path=customXml/itemProps3.xml><?xml version="1.0" encoding="utf-8"?>
-<ds:datastoreItem xmlns:ds="http://schemas.openxmlformats.org/officeDocument/2006/customXml" ds:itemID="{9E1FEEAB-B510-40FA-8CAE-DC1A4BCFB7AF}">
-  <ds:schemaRefs>
-    <ds:schemaRef ds:uri="http://schemas.microsoft.com/office/2006/metadata/properties"/>
-    <ds:schemaRef ds:uri="http://schemas.microsoft.com/office/infopath/2007/PartnerControls"/>
-    <ds:schemaRef ds:uri="c0a5e2f2-cbc9-444d-acb1-da3840c97b19"/>
-    <ds:schemaRef ds:uri="17fa7942-0d9f-40ad-9093-ce71332f67f5"/>
-  </ds:schemaRefs>
-</ds:datastoreItem>
-</file>
-
 <file path=customXml/itemProps4.xml><?xml version="1.0" encoding="utf-8"?>
 <ds:datastoreItem xmlns:ds="http://schemas.openxmlformats.org/officeDocument/2006/customXml" ds:itemID="{5B075FEA-4E01-4107-8B62-6F06417D51EB}">
   <ds:schemaRefs>

</xml_diff>